<commit_message>
ezEKP Java DB Schema git에 올리는 방법 (Oracle DB) 파일 수정
</commit_message>
<xml_diff>
--- a/docs/tech/ezEKP_Java_DB_Schema_export_방법(Oracle).docx
+++ b/docs/tech/ezEKP_Java_DB_Schema_export_방법(Oracle).docx
@@ -1,6 +1,6 @@
 
 <file path=word/document.xml><?xml version="1.0" encoding="utf-8"?>
-<w:document xmlns:wpc="http://schemas.microsoft.com/office/word/2010/wordprocessingCanvas" xmlns:mc="http://schemas.openxmlformats.org/markup-compatibility/2006" xmlns:o="urn:schemas-microsoft-com:office:office" xmlns:r="http://schemas.openxmlformats.org/officeDocument/2006/relationships" xmlns:m="http://schemas.openxmlformats.org/officeDocument/2006/math" xmlns:v="urn:schemas-microsoft-com:vml" xmlns:wp14="http://schemas.microsoft.com/office/word/2010/wordprocessingDrawing" xmlns:wp="http://schemas.openxmlformats.org/drawingml/2006/wordprocessingDrawing" xmlns:w10="urn:schemas-microsoft-com:office:word" xmlns:w="http://schemas.openxmlformats.org/wordprocessingml/2006/main" xmlns:w14="http://schemas.microsoft.com/office/word/2010/wordml" xmlns:w15="http://schemas.microsoft.com/office/word/2012/wordml" xmlns:wpg="http://schemas.microsoft.com/office/word/2010/wordprocessingGroup" xmlns:wpi="http://schemas.microsoft.com/office/word/2010/wordprocessingInk" xmlns:wne="http://schemas.microsoft.com/office/word/2006/wordml" xmlns:wps="http://schemas.microsoft.com/office/word/2010/wordprocessingShape" mc:Ignorable="w14 w15 wp14">
+<w:document xmlns:wpc="http://schemas.microsoft.com/office/word/2010/wordprocessingCanvas" xmlns:cx="http://schemas.microsoft.com/office/drawing/2014/chartex" xmlns:mc="http://schemas.openxmlformats.org/markup-compatibility/2006" xmlns:o="urn:schemas-microsoft-com:office:office" xmlns:r="http://schemas.openxmlformats.org/officeDocument/2006/relationships" xmlns:m="http://schemas.openxmlformats.org/officeDocument/2006/math" xmlns:v="urn:schemas-microsoft-com:vml" xmlns:wp14="http://schemas.microsoft.com/office/word/2010/wordprocessingDrawing" xmlns:wp="http://schemas.openxmlformats.org/drawingml/2006/wordprocessingDrawing" xmlns:w10="urn:schemas-microsoft-com:office:word" xmlns:w="http://schemas.openxmlformats.org/wordprocessingml/2006/main" xmlns:w14="http://schemas.microsoft.com/office/word/2010/wordml" xmlns:w15="http://schemas.microsoft.com/office/word/2012/wordml" xmlns:w16se="http://schemas.microsoft.com/office/word/2015/wordml/symex" xmlns:wpg="http://schemas.microsoft.com/office/word/2010/wordprocessingGroup" xmlns:wpi="http://schemas.microsoft.com/office/word/2010/wordprocessingInk" xmlns:wne="http://schemas.microsoft.com/office/word/2006/wordml" xmlns:wps="http://schemas.microsoft.com/office/word/2010/wordprocessingShape" mc:Ignorable="w14 w15 w16se wp14">
   <w:body>
     <w:p>
       <w:pPr>
@@ -85,32 +85,41 @@
         <w:pStyle w:val="a3"/>
         <w:spacing w:before="0" w:beforeAutospacing="0" w:after="0" w:afterAutospacing="0" w:line="300" w:lineRule="atLeast"/>
         <w:rPr>
-          <w:rFonts w:ascii="맑은 고딕" w:eastAsia="맑은 고딕" w:hAnsi="맑은 고딕" w:hint="eastAsia"/>
-          <w:color w:val="000000"/>
-          <w:sz w:val="20"/>
-          <w:szCs w:val="20"/>
-        </w:rPr>
-      </w:pPr>
-    </w:p>
-    <w:p>
-      <w:pPr>
-        <w:pStyle w:val="a3"/>
-        <w:spacing w:before="0" w:beforeAutospacing="0" w:after="0" w:afterAutospacing="0" w:line="300" w:lineRule="atLeast"/>
-        <w:rPr>
-          <w:rFonts w:ascii="맑은 고딕" w:eastAsia="맑은 고딕" w:hAnsi="맑은 고딕" w:hint="eastAsia"/>
-          <w:color w:val="000000"/>
-          <w:sz w:val="20"/>
-          <w:szCs w:val="20"/>
-        </w:rPr>
-      </w:pPr>
-      <w:r>
-        <w:rPr>
-          <w:rFonts w:ascii="맑은 고딕" w:eastAsia="맑은 고딕" w:hAnsi="맑은 고딕" w:hint="eastAsia"/>
-          <w:color w:val="000000"/>
-          <w:sz w:val="21"/>
-          <w:szCs w:val="21"/>
-        </w:rPr>
-        <w:t>1. 오라클디벨로퍼에서도구 &gt; </w:t>
+          <w:rFonts w:ascii="맑은 고딕" w:eastAsia="맑은 고딕" w:hAnsi="맑은 고딕"/>
+          <w:color w:val="000000"/>
+          <w:sz w:val="20"/>
+          <w:szCs w:val="20"/>
+        </w:rPr>
+      </w:pPr>
+    </w:p>
+    <w:p>
+      <w:pPr>
+        <w:pStyle w:val="a3"/>
+        <w:spacing w:before="0" w:beforeAutospacing="0" w:after="0" w:afterAutospacing="0" w:line="300" w:lineRule="atLeast"/>
+        <w:rPr>
+          <w:rFonts w:ascii="맑은 고딕" w:eastAsia="맑은 고딕" w:hAnsi="맑은 고딕"/>
+          <w:color w:val="000000"/>
+          <w:sz w:val="20"/>
+          <w:szCs w:val="20"/>
+        </w:rPr>
+      </w:pPr>
+      <w:r>
+        <w:rPr>
+          <w:rFonts w:ascii="맑은 고딕" w:eastAsia="맑은 고딕" w:hAnsi="맑은 고딕" w:hint="eastAsia"/>
+          <w:color w:val="000000"/>
+          <w:sz w:val="21"/>
+          <w:szCs w:val="21"/>
+        </w:rPr>
+        <w:t>1. 오라클</w:t>
+      </w:r>
+      <w:r>
+        <w:rPr>
+          <w:rFonts w:ascii="맑은 고딕" w:eastAsia="맑은 고딕" w:hAnsi="맑은 고딕" w:hint="eastAsia"/>
+          <w:color w:val="000000"/>
+          <w:sz w:val="21"/>
+          <w:szCs w:val="21"/>
+        </w:rPr>
+        <w:t xml:space="preserve"> </w:t>
       </w:r>
       <w:proofErr w:type="spellStart"/>
       <w:r>
@@ -120,28 +129,84 @@
           <w:sz w:val="21"/>
           <w:szCs w:val="21"/>
         </w:rPr>
-        <w:t>데이터베이스익스포트클릭</w:t>
+        <w:t>디벨로퍼에서</w:t>
       </w:r>
       <w:proofErr w:type="spellEnd"/>
-    </w:p>
-    <w:p>
-      <w:pPr>
-        <w:pStyle w:val="a3"/>
-        <w:spacing w:before="0" w:beforeAutospacing="0" w:after="0" w:afterAutospacing="0" w:line="300" w:lineRule="atLeast"/>
-        <w:rPr>
-          <w:rFonts w:ascii="맑은 고딕" w:eastAsia="맑은 고딕" w:hAnsi="맑은 고딕" w:hint="eastAsia"/>
-          <w:color w:val="000000"/>
-          <w:sz w:val="20"/>
-          <w:szCs w:val="20"/>
-        </w:rPr>
-      </w:pPr>
-    </w:p>
-    <w:p>
-      <w:pPr>
-        <w:pStyle w:val="a3"/>
-        <w:spacing w:before="0" w:beforeAutospacing="0" w:after="0" w:afterAutospacing="0" w:line="300" w:lineRule="atLeast"/>
-        <w:rPr>
-          <w:rFonts w:ascii="맑은 고딕" w:eastAsia="맑은 고딕" w:hAnsi="맑은 고딕" w:hint="eastAsia"/>
+      <w:r>
+        <w:rPr>
+          <w:rFonts w:ascii="맑은 고딕" w:eastAsia="맑은 고딕" w:hAnsi="맑은 고딕" w:hint="eastAsia"/>
+          <w:color w:val="000000"/>
+          <w:sz w:val="21"/>
+          <w:szCs w:val="21"/>
+        </w:rPr>
+        <w:t xml:space="preserve"> </w:t>
+      </w:r>
+      <w:r>
+        <w:rPr>
+          <w:rFonts w:ascii="맑은 고딕" w:eastAsia="맑은 고딕" w:hAnsi="맑은 고딕" w:hint="eastAsia"/>
+          <w:color w:val="000000"/>
+          <w:sz w:val="21"/>
+          <w:szCs w:val="21"/>
+        </w:rPr>
+        <w:t>도구 &gt; 데이터베이스</w:t>
+      </w:r>
+      <w:r>
+        <w:rPr>
+          <w:rFonts w:ascii="맑은 고딕" w:eastAsia="맑은 고딕" w:hAnsi="맑은 고딕" w:hint="eastAsia"/>
+          <w:color w:val="000000"/>
+          <w:sz w:val="21"/>
+          <w:szCs w:val="21"/>
+        </w:rPr>
+        <w:t xml:space="preserve"> </w:t>
+      </w:r>
+      <w:proofErr w:type="spellStart"/>
+      <w:r>
+        <w:rPr>
+          <w:rFonts w:ascii="맑은 고딕" w:eastAsia="맑은 고딕" w:hAnsi="맑은 고딕" w:hint="eastAsia"/>
+          <w:color w:val="000000"/>
+          <w:sz w:val="21"/>
+          <w:szCs w:val="21"/>
+        </w:rPr>
+        <w:t>익스포트</w:t>
+      </w:r>
+      <w:proofErr w:type="spellEnd"/>
+      <w:r>
+        <w:rPr>
+          <w:rFonts w:ascii="맑은 고딕" w:eastAsia="맑은 고딕" w:hAnsi="맑은 고딕" w:hint="eastAsia"/>
+          <w:color w:val="000000"/>
+          <w:sz w:val="21"/>
+          <w:szCs w:val="21"/>
+        </w:rPr>
+        <w:t xml:space="preserve"> </w:t>
+      </w:r>
+      <w:r>
+        <w:rPr>
+          <w:rFonts w:ascii="맑은 고딕" w:eastAsia="맑은 고딕" w:hAnsi="맑은 고딕" w:hint="eastAsia"/>
+          <w:color w:val="000000"/>
+          <w:sz w:val="21"/>
+          <w:szCs w:val="21"/>
+        </w:rPr>
+        <w:t>클릭</w:t>
+      </w:r>
+    </w:p>
+    <w:p>
+      <w:pPr>
+        <w:pStyle w:val="a3"/>
+        <w:spacing w:before="0" w:beforeAutospacing="0" w:after="0" w:afterAutospacing="0" w:line="300" w:lineRule="atLeast"/>
+        <w:rPr>
+          <w:rFonts w:ascii="맑은 고딕" w:eastAsia="맑은 고딕" w:hAnsi="맑은 고딕"/>
+          <w:color w:val="000000"/>
+          <w:sz w:val="20"/>
+          <w:szCs w:val="20"/>
+        </w:rPr>
+      </w:pPr>
+    </w:p>
+    <w:p>
+      <w:pPr>
+        <w:pStyle w:val="a3"/>
+        <w:spacing w:before="0" w:beforeAutospacing="0" w:after="0" w:afterAutospacing="0" w:line="300" w:lineRule="atLeast"/>
+        <w:rPr>
+          <w:rFonts w:ascii="맑은 고딕" w:eastAsia="맑은 고딕" w:hAnsi="맑은 고딕"/>
           <w:color w:val="000000"/>
           <w:sz w:val="20"/>
           <w:szCs w:val="20"/>
@@ -220,32 +285,41 @@
         <w:pStyle w:val="a3"/>
         <w:spacing w:before="0" w:beforeAutospacing="0" w:after="0" w:afterAutospacing="0" w:line="300" w:lineRule="atLeast"/>
         <w:rPr>
-          <w:rFonts w:ascii="맑은 고딕" w:eastAsia="맑은 고딕" w:hAnsi="맑은 고딕" w:hint="eastAsia"/>
-          <w:color w:val="000000"/>
-          <w:sz w:val="20"/>
-          <w:szCs w:val="20"/>
-        </w:rPr>
-      </w:pPr>
-    </w:p>
-    <w:p>
-      <w:pPr>
-        <w:pStyle w:val="a3"/>
-        <w:spacing w:before="0" w:beforeAutospacing="0" w:after="0" w:afterAutospacing="0" w:line="300" w:lineRule="atLeast"/>
-        <w:rPr>
-          <w:rFonts w:ascii="맑은 고딕" w:eastAsia="맑은 고딕" w:hAnsi="맑은 고딕" w:hint="eastAsia"/>
-          <w:color w:val="000000"/>
-          <w:sz w:val="20"/>
-          <w:szCs w:val="20"/>
-        </w:rPr>
-      </w:pPr>
-      <w:r>
-        <w:rPr>
-          <w:rFonts w:ascii="맑은 고딕" w:eastAsia="맑은 고딕" w:hAnsi="맑은 고딕" w:hint="eastAsia"/>
-          <w:color w:val="000000"/>
-          <w:sz w:val="21"/>
-          <w:szCs w:val="21"/>
-        </w:rPr>
-        <w:t xml:space="preserve">2. </w:t>
+          <w:rFonts w:ascii="맑은 고딕" w:eastAsia="맑은 고딕" w:hAnsi="맑은 고딕"/>
+          <w:color w:val="000000"/>
+          <w:sz w:val="20"/>
+          <w:szCs w:val="20"/>
+        </w:rPr>
+      </w:pPr>
+    </w:p>
+    <w:p>
+      <w:pPr>
+        <w:pStyle w:val="a3"/>
+        <w:spacing w:before="0" w:beforeAutospacing="0" w:after="0" w:afterAutospacing="0" w:line="300" w:lineRule="atLeast"/>
+        <w:rPr>
+          <w:rFonts w:ascii="맑은 고딕" w:eastAsia="맑은 고딕" w:hAnsi="맑은 고딕"/>
+          <w:color w:val="000000"/>
+          <w:sz w:val="20"/>
+          <w:szCs w:val="20"/>
+        </w:rPr>
+      </w:pPr>
+      <w:r>
+        <w:rPr>
+          <w:rFonts w:ascii="맑은 고딕" w:eastAsia="맑은 고딕" w:hAnsi="맑은 고딕" w:hint="eastAsia"/>
+          <w:color w:val="000000"/>
+          <w:sz w:val="21"/>
+          <w:szCs w:val="21"/>
+        </w:rPr>
+        <w:t>2. 접속</w:t>
+      </w:r>
+      <w:r>
+        <w:rPr>
+          <w:rFonts w:ascii="맑은 고딕" w:eastAsia="맑은 고딕" w:hAnsi="맑은 고딕" w:hint="eastAsia"/>
+          <w:color w:val="000000"/>
+          <w:sz w:val="21"/>
+          <w:szCs w:val="21"/>
+        </w:rPr>
+        <w:t xml:space="preserve"> </w:t>
       </w:r>
       <w:proofErr w:type="spellStart"/>
       <w:r>
@@ -255,7 +329,7 @@
           <w:sz w:val="21"/>
           <w:szCs w:val="21"/>
         </w:rPr>
-        <w:t>접속셀렉트에서익스포트할</w:t>
+        <w:t>셀렉트에서</w:t>
       </w:r>
       <w:proofErr w:type="spellEnd"/>
       <w:r>
@@ -265,6 +339,26 @@
           <w:sz w:val="21"/>
           <w:szCs w:val="21"/>
         </w:rPr>
+        <w:t xml:space="preserve"> </w:t>
+      </w:r>
+      <w:proofErr w:type="spellStart"/>
+      <w:r>
+        <w:rPr>
+          <w:rFonts w:ascii="맑은 고딕" w:eastAsia="맑은 고딕" w:hAnsi="맑은 고딕" w:hint="eastAsia"/>
+          <w:color w:val="000000"/>
+          <w:sz w:val="21"/>
+          <w:szCs w:val="21"/>
+        </w:rPr>
+        <w:t>익스포트할</w:t>
+      </w:r>
+      <w:proofErr w:type="spellEnd"/>
+      <w:r>
+        <w:rPr>
+          <w:rFonts w:ascii="맑은 고딕" w:eastAsia="맑은 고딕" w:hAnsi="맑은 고딕" w:hint="eastAsia"/>
+          <w:color w:val="000000"/>
+          <w:sz w:val="21"/>
+          <w:szCs w:val="21"/>
+        </w:rPr>
         <w:t> 스키마 선택</w:t>
       </w:r>
     </w:p>
@@ -273,7 +367,7 @@
         <w:pStyle w:val="a3"/>
         <w:spacing w:before="0" w:beforeAutospacing="0" w:after="0" w:afterAutospacing="0" w:line="300" w:lineRule="atLeast"/>
         <w:rPr>
-          <w:rFonts w:ascii="맑은 고딕" w:eastAsia="맑은 고딕" w:hAnsi="맑은 고딕" w:hint="eastAsia"/>
+          <w:rFonts w:ascii="맑은 고딕" w:eastAsia="맑은 고딕" w:hAnsi="맑은 고딕"/>
           <w:color w:val="000000"/>
           <w:sz w:val="22"/>
           <w:szCs w:val="22"/>
@@ -285,12 +379,37 @@
         <w:pStyle w:val="a3"/>
         <w:spacing w:before="0" w:beforeAutospacing="0" w:after="0" w:afterAutospacing="0" w:line="300" w:lineRule="atLeast"/>
         <w:rPr>
-          <w:rFonts w:ascii="맑은 고딕" w:eastAsia="맑은 고딕" w:hAnsi="맑은 고딕" w:hint="eastAsia"/>
-          <w:color w:val="000000"/>
-          <w:sz w:val="20"/>
-          <w:szCs w:val="20"/>
-        </w:rPr>
-      </w:pPr>
+          <w:rFonts w:ascii="맑은 고딕" w:eastAsia="맑은 고딕" w:hAnsi="맑은 고딕"/>
+          <w:color w:val="000000"/>
+          <w:sz w:val="20"/>
+          <w:szCs w:val="20"/>
+        </w:rPr>
+      </w:pPr>
+    </w:p>
+    <w:p>
+      <w:pPr>
+        <w:pStyle w:val="a3"/>
+        <w:spacing w:before="0" w:beforeAutospacing="0" w:after="0" w:afterAutospacing="0" w:line="300" w:lineRule="atLeast"/>
+        <w:rPr>
+          <w:rFonts w:ascii="맑은 고딕" w:eastAsia="맑은 고딕" w:hAnsi="맑은 고딕"/>
+          <w:color w:val="000000"/>
+          <w:sz w:val="20"/>
+          <w:szCs w:val="20"/>
+        </w:rPr>
+      </w:pPr>
+    </w:p>
+    <w:p>
+      <w:pPr>
+        <w:pStyle w:val="a3"/>
+        <w:spacing w:before="0" w:beforeAutospacing="0" w:after="0" w:afterAutospacing="0" w:line="300" w:lineRule="atLeast"/>
+        <w:rPr>
+          <w:rFonts w:ascii="맑은 고딕" w:eastAsia="맑은 고딕" w:hAnsi="맑은 고딕"/>
+          <w:color w:val="000000"/>
+          <w:sz w:val="20"/>
+          <w:szCs w:val="20"/>
+        </w:rPr>
+      </w:pPr>
+      <w:bookmarkStart w:id="0" w:name="_GoBack"/>
       <w:r>
         <w:rPr>
           <w:rFonts w:ascii="맑은 고딕" w:eastAsia="맑은 고딕" w:hAnsi="맑은 고딕"/>
@@ -302,9 +421,9 @@
         <w:lastRenderedPageBreak/>
         <w:drawing>
           <wp:inline distT="0" distB="0" distL="0" distR="0">
-            <wp:extent cx="6721475" cy="5466080"/>
-            <wp:effectExtent l="0" t="0" r="3175" b="1270"/>
-            <wp:docPr id="19" name="그림 19" descr="http://gw.kaoni.com/fileroot/0/files/upload_common/mhtImage/3b7bd452-1c66-4334-85cc-83ee856a4a8e.png"/>
+            <wp:extent cx="5943600" cy="4633595"/>
+            <wp:effectExtent l="0" t="0" r="0" b="0"/>
+            <wp:docPr id="19" name="그림 19"/>
             <wp:cNvGraphicFramePr>
               <a:graphicFrameLocks xmlns:a="http://schemas.openxmlformats.org/drawingml/2006/main" noChangeAspect="1"/>
             </wp:cNvGraphicFramePr>
@@ -312,10 +431,8 @@
               <a:graphicData uri="http://schemas.openxmlformats.org/drawingml/2006/picture">
                 <pic:pic xmlns:pic="http://schemas.openxmlformats.org/drawingml/2006/picture">
                   <pic:nvPicPr>
-                    <pic:cNvPr id="0" name="Picture 3" descr="http://gw.kaoni.com/fileroot/0/files/upload_common/mhtImage/3b7bd452-1c66-4334-85cc-83ee856a4a8e.png"/>
-                    <pic:cNvPicPr>
-                      <a:picLocks noChangeAspect="1" noChangeArrowheads="1"/>
-                    </pic:cNvPicPr>
+                    <pic:cNvPr id="19" name="2.PNG"/>
+                    <pic:cNvPicPr/>
                   </pic:nvPicPr>
                   <pic:blipFill>
                     <a:blip r:embed="rId6">
@@ -325,23 +442,18 @@
                         </a:ext>
                       </a:extLst>
                     </a:blip>
-                    <a:srcRect/>
                     <a:stretch>
                       <a:fillRect/>
                     </a:stretch>
                   </pic:blipFill>
-                  <pic:spPr bwMode="auto">
+                  <pic:spPr>
                     <a:xfrm>
                       <a:off x="0" y="0"/>
-                      <a:ext cx="6721475" cy="5466080"/>
+                      <a:ext cx="5943600" cy="4633595"/>
                     </a:xfrm>
                     <a:prstGeom prst="rect">
                       <a:avLst/>
                     </a:prstGeom>
-                    <a:noFill/>
-                    <a:ln>
-                      <a:noFill/>
-                    </a:ln>
                   </pic:spPr>
                 </pic:pic>
               </a:graphicData>
@@ -349,38 +461,48 @@
           </wp:inline>
         </w:drawing>
       </w:r>
-    </w:p>
-    <w:p>
-      <w:pPr>
-        <w:pStyle w:val="a3"/>
-        <w:spacing w:before="0" w:beforeAutospacing="0" w:after="0" w:afterAutospacing="0" w:line="300" w:lineRule="atLeast"/>
-        <w:rPr>
-          <w:rFonts w:ascii="맑은 고딕" w:eastAsia="맑은 고딕" w:hAnsi="맑은 고딕" w:hint="eastAsia"/>
-          <w:color w:val="000000"/>
-          <w:sz w:val="20"/>
-          <w:szCs w:val="20"/>
-        </w:rPr>
-      </w:pPr>
-    </w:p>
-    <w:p>
-      <w:pPr>
-        <w:pStyle w:val="a3"/>
-        <w:spacing w:before="0" w:beforeAutospacing="0" w:after="0" w:afterAutospacing="0" w:line="300" w:lineRule="atLeast"/>
-        <w:rPr>
-          <w:rFonts w:ascii="맑은 고딕" w:eastAsia="맑은 고딕" w:hAnsi="맑은 고딕" w:hint="eastAsia"/>
-          <w:color w:val="000000"/>
-          <w:sz w:val="20"/>
-          <w:szCs w:val="20"/>
-        </w:rPr>
-      </w:pPr>
-      <w:r>
-        <w:rPr>
-          <w:rFonts w:ascii="맑은 고딕" w:eastAsia="맑은 고딕" w:hAnsi="맑은 고딕" w:hint="eastAsia"/>
-          <w:color w:val="000000"/>
-          <w:sz w:val="21"/>
-          <w:szCs w:val="21"/>
-        </w:rPr>
-        <w:t>3. 데이터는뽑지않을것으로, </w:t>
+      <w:bookmarkEnd w:id="0"/>
+    </w:p>
+    <w:p>
+      <w:pPr>
+        <w:pStyle w:val="a3"/>
+        <w:spacing w:before="0" w:beforeAutospacing="0" w:after="0" w:afterAutospacing="0" w:line="300" w:lineRule="atLeast"/>
+        <w:rPr>
+          <w:rFonts w:ascii="맑은 고딕" w:eastAsia="맑은 고딕" w:hAnsi="맑은 고딕"/>
+          <w:color w:val="000000"/>
+          <w:sz w:val="20"/>
+          <w:szCs w:val="20"/>
+        </w:rPr>
+      </w:pPr>
+    </w:p>
+    <w:p>
+      <w:pPr>
+        <w:pStyle w:val="a3"/>
+        <w:spacing w:before="0" w:beforeAutospacing="0" w:after="0" w:afterAutospacing="0" w:line="300" w:lineRule="atLeast"/>
+        <w:rPr>
+          <w:rFonts w:ascii="맑은 고딕" w:eastAsia="맑은 고딕" w:hAnsi="맑은 고딕"/>
+          <w:color w:val="000000"/>
+          <w:sz w:val="20"/>
+          <w:szCs w:val="20"/>
+        </w:rPr>
+      </w:pPr>
+      <w:r>
+        <w:rPr>
+          <w:rFonts w:ascii="맑은 고딕" w:eastAsia="맑은 고딕" w:hAnsi="맑은 고딕" w:hint="eastAsia"/>
+          <w:color w:val="000000"/>
+          <w:sz w:val="21"/>
+          <w:szCs w:val="21"/>
+        </w:rPr>
+        <w:t>3. 데이터는</w:t>
+      </w:r>
+      <w:r>
+        <w:rPr>
+          <w:rFonts w:ascii="맑은 고딕" w:eastAsia="맑은 고딕" w:hAnsi="맑은 고딕" w:hint="eastAsia"/>
+          <w:color w:val="000000"/>
+          <w:sz w:val="21"/>
+          <w:szCs w:val="21"/>
+        </w:rPr>
+        <w:t xml:space="preserve"> </w:t>
       </w:r>
       <w:proofErr w:type="spellStart"/>
       <w:r>
@@ -390,7 +512,7 @@
           <w:sz w:val="21"/>
           <w:szCs w:val="21"/>
         </w:rPr>
-        <w:t>데이터익스포트체크해제</w:t>
+        <w:t>뽑지않을것으로</w:t>
       </w:r>
       <w:proofErr w:type="spellEnd"/>
       <w:r>
@@ -400,7 +522,16 @@
           <w:sz w:val="21"/>
           <w:szCs w:val="21"/>
         </w:rPr>
-        <w:t>, </w:t>
+        <w:t>, 데이터</w:t>
+      </w:r>
+      <w:r>
+        <w:rPr>
+          <w:rFonts w:ascii="맑은 고딕" w:eastAsia="맑은 고딕" w:hAnsi="맑은 고딕" w:hint="eastAsia"/>
+          <w:color w:val="000000"/>
+          <w:sz w:val="21"/>
+          <w:szCs w:val="21"/>
+        </w:rPr>
+        <w:t xml:space="preserve"> </w:t>
       </w:r>
       <w:proofErr w:type="spellStart"/>
       <w:r>
@@ -410,6 +541,35 @@
           <w:sz w:val="21"/>
           <w:szCs w:val="21"/>
         </w:rPr>
+        <w:t>익스포트</w:t>
+      </w:r>
+      <w:proofErr w:type="spellEnd"/>
+      <w:r>
+        <w:rPr>
+          <w:rFonts w:ascii="맑은 고딕" w:eastAsia="맑은 고딕" w:hAnsi="맑은 고딕" w:hint="eastAsia"/>
+          <w:color w:val="000000"/>
+          <w:sz w:val="21"/>
+          <w:szCs w:val="21"/>
+        </w:rPr>
+        <w:t xml:space="preserve"> </w:t>
+      </w:r>
+      <w:r>
+        <w:rPr>
+          <w:rFonts w:ascii="맑은 고딕" w:eastAsia="맑은 고딕" w:hAnsi="맑은 고딕" w:hint="eastAsia"/>
+          <w:color w:val="000000"/>
+          <w:sz w:val="21"/>
+          <w:szCs w:val="21"/>
+        </w:rPr>
+        <w:t>체크해제, </w:t>
+      </w:r>
+      <w:proofErr w:type="spellStart"/>
+      <w:r>
+        <w:rPr>
+          <w:rFonts w:ascii="맑은 고딕" w:eastAsia="맑은 고딕" w:hAnsi="맑은 고딕" w:hint="eastAsia"/>
+          <w:color w:val="000000"/>
+          <w:sz w:val="21"/>
+          <w:szCs w:val="21"/>
+        </w:rPr>
         <w:t>인코딩은</w:t>
       </w:r>
       <w:proofErr w:type="spellEnd"/>
@@ -438,201 +598,247 @@
         <w:pStyle w:val="a3"/>
         <w:spacing w:before="0" w:beforeAutospacing="0" w:after="0" w:afterAutospacing="0" w:line="300" w:lineRule="atLeast"/>
         <w:rPr>
-          <w:rFonts w:ascii="맑은 고딕" w:eastAsia="맑은 고딕" w:hAnsi="맑은 고딕" w:hint="eastAsia"/>
-          <w:color w:val="000000"/>
-          <w:sz w:val="20"/>
-          <w:szCs w:val="20"/>
-        </w:rPr>
-      </w:pPr>
-    </w:p>
-    <w:p>
-      <w:pPr>
-        <w:pStyle w:val="a3"/>
-        <w:spacing w:before="0" w:beforeAutospacing="0" w:after="0" w:afterAutospacing="0" w:line="300" w:lineRule="atLeast"/>
-        <w:rPr>
-          <w:rFonts w:ascii="맑은 고딕" w:eastAsia="맑은 고딕" w:hAnsi="맑은 고딕" w:hint="eastAsia"/>
-          <w:color w:val="000000"/>
-          <w:sz w:val="20"/>
-          <w:szCs w:val="20"/>
-        </w:rPr>
-      </w:pPr>
-      <w:r>
-        <w:rPr>
-          <w:rFonts w:ascii="맑은 고딕" w:eastAsia="맑은 고딕" w:hAnsi="맑은 고딕" w:hint="eastAsia"/>
-          <w:color w:val="000000"/>
-          <w:sz w:val="21"/>
-          <w:szCs w:val="21"/>
-        </w:rPr>
-        <w:t xml:space="preserve">4. DDL </w:t>
+          <w:rFonts w:ascii="맑은 고딕" w:eastAsia="맑은 고딕" w:hAnsi="맑은 고딕"/>
+          <w:color w:val="000000"/>
+          <w:sz w:val="20"/>
+          <w:szCs w:val="20"/>
+        </w:rPr>
+      </w:pPr>
+    </w:p>
+    <w:p>
+      <w:pPr>
+        <w:spacing w:after="0" w:line="240" w:lineRule="auto"/>
+        <w:rPr>
+          <w:rFonts w:ascii="맑은 고딕" w:eastAsia="맑은 고딕" w:hAnsi="맑은 고딕" w:cs="굴림"/>
+          <w:color w:val="000000"/>
+          <w:sz w:val="21"/>
+          <w:szCs w:val="21"/>
+          <w:lang w:eastAsia="ko-KR"/>
+        </w:rPr>
+      </w:pPr>
+      <w:r>
+        <w:rPr>
+          <w:rFonts w:ascii="맑은 고딕" w:eastAsia="맑은 고딕" w:hAnsi="맑은 고딕" w:cs="굴림" w:hint="eastAsia"/>
+          <w:color w:val="000000"/>
+          <w:sz w:val="21"/>
+          <w:szCs w:val="21"/>
+          <w:lang w:eastAsia="ko-KR"/>
+        </w:rPr>
+        <w:t>4. ​먼저, 우리 표준에는 byte는 표기하지 않을 것이므로 DDL익스포트 옵션에서 byte키워드 추가를 체크해제한다. </w:t>
+      </w:r>
+    </w:p>
+    <w:p>
+      <w:pPr>
+        <w:spacing w:after="0" w:line="240" w:lineRule="auto"/>
+        <w:rPr>
+          <w:rFonts w:ascii="맑은 고딕" w:eastAsia="맑은 고딕" w:hAnsi="맑은 고딕" w:cs="굴림"/>
+          <w:color w:val="000000"/>
+          <w:sz w:val="21"/>
+          <w:szCs w:val="21"/>
+          <w:lang w:eastAsia="ko-KR"/>
+        </w:rPr>
+      </w:pPr>
+      <w:r>
+        <w:rPr>
+          <w:rFonts w:ascii="맑은 고딕" w:eastAsia="맑은 고딕" w:hAnsi="맑은 고딕" w:cs="굴림" w:hint="eastAsia"/>
+          <w:color w:val="000000"/>
+          <w:sz w:val="21"/>
+          <w:szCs w:val="21"/>
+          <w:lang w:eastAsia="ko-KR"/>
+        </w:rPr>
+        <w:t>DDL익스포트 옵션</w:t>
+      </w:r>
+      <w:r>
+        <w:rPr>
+          <w:rFonts w:ascii="맑은 고딕" w:eastAsia="맑은 고딕" w:hAnsi="맑은 고딕" w:cs="굴림" w:hint="eastAsia"/>
+          <w:color w:val="000000"/>
+          <w:sz w:val="21"/>
+          <w:szCs w:val="21"/>
+          <w:lang w:eastAsia="ko-KR"/>
+        </w:rPr>
+        <w:t xml:space="preserve"> </w:t>
+      </w:r>
+      <w:r>
+        <w:rPr>
+          <w:rFonts w:ascii="맑은 고딕" w:eastAsia="맑은 고딕" w:hAnsi="맑은 고딕" w:cs="굴림"/>
+          <w:color w:val="000000"/>
+          <w:sz w:val="21"/>
+          <w:szCs w:val="21"/>
+          <w:lang w:eastAsia="ko-KR"/>
+        </w:rPr>
+        <w:t>5</w:t>
+      </w:r>
+      <w:r>
+        <w:rPr>
+          <w:rFonts w:ascii="맑은 고딕" w:eastAsia="맑은 고딕" w:hAnsi="맑은 고딕" w:cs="굴림" w:hint="eastAsia"/>
+          <w:color w:val="000000"/>
+          <w:sz w:val="21"/>
+          <w:szCs w:val="21"/>
+          <w:lang w:eastAsia="ko-KR"/>
+        </w:rPr>
+        <w:t>가지</w:t>
+      </w:r>
+      <w:r>
+        <w:rPr>
+          <w:rFonts w:ascii="맑은 고딕" w:eastAsia="맑은 고딕" w:hAnsi="맑은 고딕" w:cs="굴림" w:hint="eastAsia"/>
+          <w:color w:val="000000"/>
+          <w:sz w:val="21"/>
+          <w:szCs w:val="21"/>
+          <w:lang w:eastAsia="ko-KR"/>
+        </w:rPr>
+        <w:t>(보기</w:t>
+      </w:r>
+      <w:r>
+        <w:rPr>
+          <w:rFonts w:ascii="맑은 고딕" w:eastAsia="맑은 고딕" w:hAnsi="맑은 고딕" w:cs="굴림" w:hint="eastAsia"/>
+          <w:color w:val="000000"/>
+          <w:sz w:val="21"/>
+          <w:szCs w:val="21"/>
+          <w:lang w:eastAsia="ko-KR"/>
+        </w:rPr>
+        <w:t xml:space="preserve"> </w:t>
+      </w:r>
+      <w:r>
+        <w:rPr>
+          <w:rFonts w:ascii="맑은 고딕" w:eastAsia="맑은 고딕" w:hAnsi="맑은 고딕" w:cs="굴림" w:hint="eastAsia"/>
+          <w:color w:val="000000"/>
+          <w:sz w:val="21"/>
+          <w:szCs w:val="21"/>
+          <w:lang w:eastAsia="ko-KR"/>
+        </w:rPr>
+        <w:t>쉽게</w:t>
+      </w:r>
+      <w:r>
+        <w:rPr>
+          <w:rFonts w:ascii="맑은 고딕" w:eastAsia="맑은 고딕" w:hAnsi="맑은 고딕" w:cs="굴림" w:hint="eastAsia"/>
+          <w:color w:val="000000"/>
+          <w:sz w:val="21"/>
+          <w:szCs w:val="21"/>
+          <w:lang w:eastAsia="ko-KR"/>
+        </w:rPr>
+        <w:t xml:space="preserve"> </w:t>
+      </w:r>
+      <w:r>
+        <w:rPr>
+          <w:rFonts w:ascii="맑은 고딕" w:eastAsia="맑은 고딕" w:hAnsi="맑은 고딕" w:cs="굴림" w:hint="eastAsia"/>
+          <w:color w:val="000000"/>
+          <w:sz w:val="21"/>
+          <w:szCs w:val="21"/>
+          <w:lang w:eastAsia="ko-KR"/>
+        </w:rPr>
+        <w:t>인쇄, 스키마에</w:t>
+      </w:r>
+      <w:r>
+        <w:rPr>
+          <w:rFonts w:ascii="맑은 고딕" w:eastAsia="맑은 고딕" w:hAnsi="맑은 고딕" w:cs="굴림" w:hint="eastAsia"/>
+          <w:color w:val="000000"/>
+          <w:sz w:val="21"/>
+          <w:szCs w:val="21"/>
+          <w:lang w:eastAsia="ko-KR"/>
+        </w:rPr>
+        <w:t xml:space="preserve"> </w:t>
+      </w:r>
+      <w:r>
+        <w:rPr>
+          <w:rFonts w:ascii="맑은 고딕" w:eastAsia="맑은 고딕" w:hAnsi="맑은 고딕" w:cs="굴림" w:hint="eastAsia"/>
+          <w:color w:val="000000"/>
+          <w:sz w:val="21"/>
+          <w:szCs w:val="21"/>
+          <w:lang w:eastAsia="ko-KR"/>
+        </w:rPr>
+        <w:t>표시, 터미네이터, 뷰에</w:t>
       </w:r>
       <w:proofErr w:type="spellStart"/>
       <w:r>
         <w:rPr>
-          <w:rFonts w:ascii="맑은 고딕" w:eastAsia="맑은 고딕" w:hAnsi="맑은 고딕" w:hint="eastAsia"/>
-          <w:color w:val="000000"/>
-          <w:sz w:val="21"/>
-          <w:szCs w:val="21"/>
-        </w:rPr>
-        <w:t>익스포트</w:t>
+          <w:rFonts w:ascii="맑은 고딕" w:eastAsia="맑은 고딕" w:hAnsi="맑은 고딕" w:cs="굴림" w:hint="eastAsia"/>
+          <w:color w:val="000000"/>
+          <w:sz w:val="21"/>
+          <w:szCs w:val="21"/>
+          <w:lang w:val="x-none" w:eastAsia="ko-KR"/>
+        </w:rPr>
+        <w:t>force</w:t>
+      </w:r>
+      <w:r>
+        <w:rPr>
+          <w:rFonts w:ascii="맑은 고딕" w:eastAsia="맑은 고딕" w:hAnsi="맑은 고딕" w:cs="굴림" w:hint="eastAsia"/>
+          <w:color w:val="000000"/>
+          <w:sz w:val="21"/>
+          <w:szCs w:val="21"/>
+          <w:lang w:eastAsia="ko-KR"/>
+        </w:rPr>
+        <w:t>추가</w:t>
       </w:r>
       <w:proofErr w:type="spellEnd"/>
       <w:r>
         <w:rPr>
-          <w:rFonts w:ascii="맑은 고딕" w:eastAsia="맑은 고딕" w:hAnsi="맑은 고딕" w:hint="eastAsia"/>
-          <w:color w:val="000000"/>
-          <w:sz w:val="21"/>
-          <w:szCs w:val="21"/>
-        </w:rPr>
-        <w:t> </w:t>
-      </w:r>
-      <w:proofErr w:type="gramStart"/>
-      <w:r>
-        <w:rPr>
-          <w:rFonts w:ascii="맑은 고딕" w:eastAsia="맑은 고딕" w:hAnsi="맑은 고딕" w:hint="eastAsia"/>
-          <w:color w:val="000000"/>
-          <w:sz w:val="21"/>
-          <w:szCs w:val="21"/>
-        </w:rPr>
-        <w:t>옵션(</w:t>
-      </w:r>
-      <w:proofErr w:type="spellStart"/>
-      <w:proofErr w:type="gramEnd"/>
-      <w:r>
-        <w:rPr>
-          <w:rFonts w:ascii="맑은 고딕" w:eastAsia="맑은 고딕" w:hAnsi="맑은 고딕" w:hint="eastAsia"/>
-          <w:color w:val="000000"/>
-          <w:sz w:val="21"/>
-          <w:szCs w:val="21"/>
-        </w:rPr>
-        <w:t>보기쉽게인쇄</w:t>
-      </w:r>
-      <w:proofErr w:type="spellEnd"/>
-      <w:r>
-        <w:rPr>
-          <w:rFonts w:ascii="맑은 고딕" w:eastAsia="맑은 고딕" w:hAnsi="맑은 고딕" w:hint="eastAsia"/>
-          <w:color w:val="000000"/>
-          <w:sz w:val="21"/>
-          <w:szCs w:val="21"/>
-        </w:rPr>
-        <w:t>, </w:t>
-      </w:r>
-      <w:proofErr w:type="spellStart"/>
-      <w:r>
-        <w:rPr>
-          <w:rFonts w:ascii="맑은 고딕" w:eastAsia="맑은 고딕" w:hAnsi="맑은 고딕" w:hint="eastAsia"/>
-          <w:color w:val="000000"/>
-          <w:sz w:val="21"/>
-          <w:szCs w:val="21"/>
-        </w:rPr>
-        <w:t>스키마에표시</w:t>
-      </w:r>
-      <w:proofErr w:type="spellEnd"/>
-      <w:r>
-        <w:rPr>
-          <w:rFonts w:ascii="맑은 고딕" w:eastAsia="맑은 고딕" w:hAnsi="맑은 고딕" w:hint="eastAsia"/>
-          <w:color w:val="000000"/>
-          <w:sz w:val="21"/>
-          <w:szCs w:val="21"/>
-        </w:rPr>
-        <w:t>, </w:t>
-      </w:r>
-      <w:proofErr w:type="spellStart"/>
-      <w:r>
-        <w:rPr>
-          <w:rFonts w:ascii="맑은 고딕" w:eastAsia="맑은 고딕" w:hAnsi="맑은 고딕" w:hint="eastAsia"/>
-          <w:color w:val="000000"/>
-          <w:sz w:val="21"/>
-          <w:szCs w:val="21"/>
-        </w:rPr>
-        <w:t>터미네이터</w:t>
-      </w:r>
-      <w:proofErr w:type="spellEnd"/>
-      <w:r>
-        <w:rPr>
-          <w:rFonts w:ascii="맑은 고딕" w:eastAsia="맑은 고딕" w:hAnsi="맑은 고딕" w:hint="eastAsia"/>
-          <w:color w:val="000000"/>
-          <w:sz w:val="21"/>
-          <w:szCs w:val="21"/>
-        </w:rPr>
-        <w:t>, </w:t>
-      </w:r>
-      <w:proofErr w:type="spellStart"/>
-      <w:r>
-        <w:rPr>
-          <w:rFonts w:ascii="맑은 고딕" w:eastAsia="맑은 고딕" w:hAnsi="맑은 고딕" w:hint="eastAsia"/>
-          <w:color w:val="000000"/>
-          <w:sz w:val="21"/>
-          <w:szCs w:val="21"/>
-        </w:rPr>
-        <w:t>뷰에</w:t>
-      </w:r>
-      <w:r>
-        <w:rPr>
-          <w:rFonts w:ascii="맑은 고딕" w:eastAsia="맑은 고딕" w:hAnsi="맑은 고딕" w:hint="eastAsia"/>
-          <w:color w:val="000000"/>
-          <w:sz w:val="21"/>
-          <w:szCs w:val="21"/>
-          <w:lang w:val="x-none"/>
-        </w:rPr>
-        <w:t>force</w:t>
-      </w:r>
-      <w:r>
-        <w:rPr>
-          <w:rFonts w:ascii="맑은 고딕" w:eastAsia="맑은 고딕" w:hAnsi="맑은 고딕" w:hint="eastAsia"/>
-          <w:color w:val="000000"/>
-          <w:sz w:val="21"/>
-          <w:szCs w:val="21"/>
-        </w:rPr>
-        <w:t>추가</w:t>
-      </w:r>
-      <w:proofErr w:type="spellEnd"/>
-      <w:r>
-        <w:rPr>
-          <w:rFonts w:ascii="맑은 고딕" w:eastAsia="맑은 고딕" w:hAnsi="맑은 고딕" w:hint="eastAsia"/>
-          <w:color w:val="000000"/>
-          <w:sz w:val="21"/>
-          <w:szCs w:val="21"/>
-        </w:rPr>
-        <w:t>, 저장영역)</w:t>
-      </w:r>
-      <w:proofErr w:type="spellStart"/>
-      <w:r>
-        <w:rPr>
-          <w:rFonts w:ascii="맑은 고딕" w:eastAsia="맑은 고딕" w:hAnsi="맑은 고딕" w:hint="eastAsia"/>
-          <w:color w:val="000000"/>
-          <w:sz w:val="21"/>
-          <w:szCs w:val="21"/>
-        </w:rPr>
-        <w:t>을선택후다음을누른다</w:t>
-      </w:r>
-      <w:proofErr w:type="spellEnd"/>
-      <w:r>
-        <w:rPr>
-          <w:rFonts w:ascii="맑은 고딕" w:eastAsia="맑은 고딕" w:hAnsi="맑은 고딕" w:hint="eastAsia"/>
-          <w:color w:val="000000"/>
-          <w:sz w:val="21"/>
-          <w:szCs w:val="21"/>
-        </w:rPr>
-        <w:t>.</w:t>
-      </w:r>
-    </w:p>
-    <w:p>
-      <w:pPr>
-        <w:pStyle w:val="a3"/>
-        <w:spacing w:before="0" w:beforeAutospacing="0" w:after="0" w:afterAutospacing="0" w:line="300" w:lineRule="atLeast"/>
-        <w:rPr>
-          <w:rFonts w:ascii="맑은 고딕" w:eastAsia="맑은 고딕" w:hAnsi="맑은 고딕" w:hint="eastAsia"/>
-          <w:color w:val="000000"/>
-          <w:sz w:val="20"/>
-          <w:szCs w:val="20"/>
-        </w:rPr>
-      </w:pPr>
-      <w:r>
-        <w:rPr>
-          <w:rFonts w:ascii="맑은 고딕" w:eastAsia="맑은 고딕" w:hAnsi="맑은 고딕" w:hint="eastAsia"/>
-          <w:color w:val="000000"/>
-          <w:sz w:val="21"/>
-          <w:szCs w:val="21"/>
+          <w:rFonts w:ascii="맑은 고딕" w:eastAsia="맑은 고딕" w:hAnsi="맑은 고딕" w:cs="굴림" w:hint="eastAsia"/>
+          <w:color w:val="000000"/>
+          <w:sz w:val="21"/>
+          <w:szCs w:val="21"/>
+          <w:lang w:eastAsia="ko-KR"/>
+        </w:rPr>
+        <w:t>, 저장</w:t>
+      </w:r>
+      <w:r>
+        <w:rPr>
+          <w:rFonts w:ascii="맑은 고딕" w:eastAsia="맑은 고딕" w:hAnsi="맑은 고딕" w:cs="굴림" w:hint="eastAsia"/>
+          <w:color w:val="000000"/>
+          <w:sz w:val="21"/>
+          <w:szCs w:val="21"/>
+          <w:lang w:eastAsia="ko-KR"/>
+        </w:rPr>
+        <w:t xml:space="preserve"> </w:t>
+      </w:r>
+      <w:r>
+        <w:rPr>
+          <w:rFonts w:ascii="맑은 고딕" w:eastAsia="맑은 고딕" w:hAnsi="맑은 고딕" w:cs="굴림" w:hint="eastAsia"/>
+          <w:color w:val="000000"/>
+          <w:sz w:val="21"/>
+          <w:szCs w:val="21"/>
+          <w:lang w:eastAsia="ko-KR"/>
+        </w:rPr>
+        <w:t>영역)</w:t>
+      </w:r>
+      <w:r>
+        <w:rPr>
+          <w:rFonts w:ascii="맑은 고딕" w:eastAsia="맑은 고딕" w:hAnsi="맑은 고딕" w:cs="굴림"/>
+          <w:color w:val="000000"/>
+          <w:sz w:val="21"/>
+          <w:szCs w:val="21"/>
+          <w:lang w:eastAsia="ko-KR"/>
+        </w:rPr>
+        <w:t xml:space="preserve"> </w:t>
+      </w:r>
+      <w:r>
+        <w:rPr>
+          <w:rFonts w:ascii="맑은 고딕" w:eastAsia="맑은 고딕" w:hAnsi="맑은 고딕" w:cs="굴림" w:hint="eastAsia"/>
+          <w:color w:val="000000"/>
+          <w:sz w:val="21"/>
+          <w:szCs w:val="21"/>
+          <w:lang w:eastAsia="ko-KR"/>
+        </w:rPr>
+        <w:t>가 체크가 잘 되어있는지 확인 후 다음을 누른다.</w:t>
+      </w:r>
+    </w:p>
+    <w:p>
+      <w:pPr>
+        <w:spacing w:after="0" w:line="240" w:lineRule="auto"/>
+        <w:rPr>
+          <w:rFonts w:ascii="맑은 고딕" w:eastAsia="맑은 고딕" w:hAnsi="맑은 고딕" w:cs="굴림"/>
+          <w:color w:val="000000"/>
+          <w:sz w:val="21"/>
+          <w:szCs w:val="21"/>
+          <w:lang w:eastAsia="ko-KR"/>
+        </w:rPr>
+      </w:pPr>
+      <w:r>
+        <w:rPr>
+          <w:rFonts w:ascii="맑은 고딕" w:eastAsia="맑은 고딕" w:hAnsi="맑은 고딕" w:cs="굴림" w:hint="eastAsia"/>
+          <w:color w:val="000000"/>
+          <w:sz w:val="21"/>
+          <w:szCs w:val="21"/>
+          <w:lang w:eastAsia="ko-KR"/>
         </w:rPr>
         <w:t>(옵션에 대한 설명은 맨 아래에 참고)</w:t>
       </w:r>
@@ -642,7 +848,7 @@
         <w:pStyle w:val="a3"/>
         <w:spacing w:before="0" w:beforeAutospacing="0" w:after="0" w:afterAutospacing="0" w:line="300" w:lineRule="atLeast"/>
         <w:rPr>
-          <w:rFonts w:ascii="맑은 고딕" w:eastAsia="맑은 고딕" w:hAnsi="맑은 고딕" w:hint="eastAsia"/>
+          <w:rFonts w:ascii="맑은 고딕" w:eastAsia="맑은 고딕" w:hAnsi="맑은 고딕"/>
           <w:color w:val="000000"/>
           <w:sz w:val="22"/>
           <w:szCs w:val="22"/>
@@ -654,7 +860,7 @@
         <w:pStyle w:val="a3"/>
         <w:spacing w:before="0" w:beforeAutospacing="0" w:after="0" w:afterAutospacing="0" w:line="300" w:lineRule="atLeast"/>
         <w:rPr>
-          <w:rFonts w:ascii="맑은 고딕" w:eastAsia="맑은 고딕" w:hAnsi="맑은 고딕" w:hint="eastAsia"/>
+          <w:rFonts w:ascii="맑은 고딕" w:eastAsia="맑은 고딕" w:hAnsi="맑은 고딕"/>
           <w:color w:val="000000"/>
           <w:sz w:val="22"/>
           <w:szCs w:val="22"/>
@@ -724,7 +930,7 @@
         <w:pStyle w:val="a3"/>
         <w:spacing w:before="0" w:beforeAutospacing="0" w:after="0" w:afterAutospacing="0" w:line="300" w:lineRule="atLeast"/>
         <w:rPr>
-          <w:rFonts w:ascii="맑은 고딕" w:eastAsia="맑은 고딕" w:hAnsi="맑은 고딕" w:hint="eastAsia"/>
+          <w:rFonts w:ascii="맑은 고딕" w:eastAsia="맑은 고딕" w:hAnsi="맑은 고딕"/>
           <w:color w:val="000000"/>
           <w:sz w:val="22"/>
           <w:szCs w:val="22"/>
@@ -736,7 +942,7 @@
         <w:pStyle w:val="a3"/>
         <w:spacing w:before="0" w:beforeAutospacing="0" w:after="0" w:afterAutospacing="0" w:line="300" w:lineRule="atLeast"/>
         <w:rPr>
-          <w:rFonts w:ascii="맑은 고딕" w:eastAsia="맑은 고딕" w:hAnsi="맑은 고딕" w:hint="eastAsia"/>
+          <w:rFonts w:ascii="맑은 고딕" w:eastAsia="맑은 고딕" w:hAnsi="맑은 고딕"/>
           <w:color w:val="000000"/>
           <w:sz w:val="20"/>
           <w:szCs w:val="20"/>
@@ -752,7 +958,6 @@
         <w:t xml:space="preserve">5. </w:t>
       </w:r>
       <w:proofErr w:type="spellStart"/>
-      <w:proofErr w:type="gramStart"/>
       <w:r>
         <w:rPr>
           <w:rFonts w:ascii="맑은 고딕" w:eastAsia="맑은 고딕" w:hAnsi="맑은 고딕" w:hint="eastAsia"/>
@@ -770,65 +975,15 @@
           <w:sz w:val="21"/>
           <w:szCs w:val="21"/>
         </w:rPr>
-        <w:t>(</w:t>
-      </w:r>
-      <w:proofErr w:type="gramEnd"/>
-      <w:r>
-        <w:rPr>
-          <w:rFonts w:ascii="맑은 고딕" w:eastAsia="맑은 고딕" w:hAnsi="맑은 고딕" w:hint="eastAsia"/>
-          <w:color w:val="000000"/>
-          <w:sz w:val="21"/>
-          <w:szCs w:val="21"/>
-        </w:rPr>
-        <w:t xml:space="preserve">테이블, </w:t>
-      </w:r>
-      <w:proofErr w:type="spellStart"/>
-      <w:r>
-        <w:rPr>
-          <w:rFonts w:ascii="맑은 고딕" w:eastAsia="맑은 고딕" w:hAnsi="맑은 고딕" w:hint="eastAsia"/>
-          <w:color w:val="000000"/>
-          <w:sz w:val="21"/>
-          <w:szCs w:val="21"/>
-        </w:rPr>
-        <w:t>뷰</w:t>
-      </w:r>
-      <w:proofErr w:type="spellEnd"/>
-      <w:r>
-        <w:rPr>
-          <w:rFonts w:ascii="맑은 고딕" w:eastAsia="맑은 고딕" w:hAnsi="맑은 고딕" w:hint="eastAsia"/>
-          <w:color w:val="000000"/>
-          <w:sz w:val="21"/>
-          <w:szCs w:val="21"/>
-        </w:rPr>
-        <w:t xml:space="preserve">, 인덱스, </w:t>
-      </w:r>
-      <w:proofErr w:type="spellStart"/>
-      <w:r>
-        <w:rPr>
-          <w:rFonts w:ascii="맑은 고딕" w:eastAsia="맑은 고딕" w:hAnsi="맑은 고딕" w:hint="eastAsia"/>
-          <w:color w:val="000000"/>
-          <w:sz w:val="21"/>
-          <w:szCs w:val="21"/>
-        </w:rPr>
-        <w:t>트리거</w:t>
-      </w:r>
-      <w:proofErr w:type="spellEnd"/>
-      <w:r>
-        <w:rPr>
-          <w:rFonts w:ascii="맑은 고딕" w:eastAsia="맑은 고딕" w:hAnsi="맑은 고딕" w:hint="eastAsia"/>
-          <w:color w:val="000000"/>
-          <w:sz w:val="21"/>
-          <w:szCs w:val="21"/>
-        </w:rPr>
-        <w:t>, 제약 조건, 참조 제약 조건, 시퀀스)선택한다 &gt; 다음</w:t>
-      </w:r>
-    </w:p>
-    <w:p>
-      <w:pPr>
-        <w:pStyle w:val="a3"/>
-        <w:spacing w:before="0" w:beforeAutospacing="0" w:after="0" w:afterAutospacing="0" w:line="300" w:lineRule="atLeast"/>
-        <w:rPr>
-          <w:rFonts w:ascii="맑은 고딕" w:eastAsia="맑은 고딕" w:hAnsi="맑은 고딕" w:hint="eastAsia"/>
+        <w:t>(테이블, 뷰, 인덱스, 트리거, 제약 조건, 참조 제약 조건, 시퀀스)선택한다 &gt; 다음</w:t>
+      </w:r>
+    </w:p>
+    <w:p>
+      <w:pPr>
+        <w:pStyle w:val="a3"/>
+        <w:spacing w:before="0" w:beforeAutospacing="0" w:after="0" w:afterAutospacing="0" w:line="300" w:lineRule="atLeast"/>
+        <w:rPr>
+          <w:rFonts w:ascii="맑은 고딕" w:eastAsia="맑은 고딕" w:hAnsi="맑은 고딕"/>
           <w:color w:val="000000"/>
           <w:sz w:val="22"/>
           <w:szCs w:val="22"/>
@@ -840,7 +995,7 @@
         <w:pStyle w:val="a3"/>
         <w:spacing w:before="0" w:beforeAutospacing="0" w:after="0" w:afterAutospacing="0" w:line="300" w:lineRule="atLeast"/>
         <w:rPr>
-          <w:rFonts w:ascii="맑은 고딕" w:eastAsia="맑은 고딕" w:hAnsi="맑은 고딕" w:hint="eastAsia"/>
+          <w:rFonts w:ascii="맑은 고딕" w:eastAsia="맑은 고딕" w:hAnsi="맑은 고딕"/>
           <w:color w:val="000000"/>
           <w:sz w:val="22"/>
           <w:szCs w:val="22"/>
@@ -910,7 +1065,7 @@
         <w:pStyle w:val="a3"/>
         <w:spacing w:before="0" w:beforeAutospacing="0" w:after="0" w:afterAutospacing="0" w:line="300" w:lineRule="atLeast"/>
         <w:rPr>
-          <w:rFonts w:ascii="맑은 고딕" w:eastAsia="맑은 고딕" w:hAnsi="맑은 고딕" w:hint="eastAsia"/>
+          <w:rFonts w:ascii="맑은 고딕" w:eastAsia="맑은 고딕" w:hAnsi="맑은 고딕"/>
           <w:color w:val="000000"/>
           <w:sz w:val="22"/>
           <w:szCs w:val="22"/>
@@ -922,7 +1077,7 @@
         <w:pStyle w:val="a3"/>
         <w:spacing w:before="0" w:beforeAutospacing="0" w:after="0" w:afterAutospacing="0" w:line="300" w:lineRule="atLeast"/>
         <w:rPr>
-          <w:rFonts w:ascii="맑은 고딕" w:eastAsia="맑은 고딕" w:hAnsi="맑은 고딕" w:hint="eastAsia"/>
+          <w:rFonts w:ascii="맑은 고딕" w:eastAsia="맑은 고딕" w:hAnsi="맑은 고딕"/>
           <w:color w:val="000000"/>
           <w:sz w:val="20"/>
           <w:szCs w:val="20"/>
@@ -943,7 +1098,7 @@
         <w:pStyle w:val="a3"/>
         <w:spacing w:before="0" w:beforeAutospacing="0" w:after="0" w:afterAutospacing="0" w:line="300" w:lineRule="atLeast"/>
         <w:rPr>
-          <w:rFonts w:ascii="맑은 고딕" w:eastAsia="맑은 고딕" w:hAnsi="맑은 고딕" w:hint="eastAsia"/>
+          <w:rFonts w:ascii="맑은 고딕" w:eastAsia="맑은 고딕" w:hAnsi="맑은 고딕"/>
           <w:color w:val="000000"/>
           <w:sz w:val="22"/>
           <w:szCs w:val="22"/>
@@ -955,7 +1110,7 @@
         <w:pStyle w:val="a3"/>
         <w:spacing w:before="0" w:beforeAutospacing="0" w:after="0" w:afterAutospacing="0" w:line="300" w:lineRule="atLeast"/>
         <w:rPr>
-          <w:rFonts w:ascii="맑은 고딕" w:eastAsia="맑은 고딕" w:hAnsi="맑은 고딕" w:hint="eastAsia"/>
+          <w:rFonts w:ascii="맑은 고딕" w:eastAsia="맑은 고딕" w:hAnsi="맑은 고딕"/>
           <w:color w:val="000000"/>
           <w:sz w:val="22"/>
           <w:szCs w:val="22"/>
@@ -1025,7 +1180,7 @@
         <w:pStyle w:val="a3"/>
         <w:spacing w:before="0" w:beforeAutospacing="0" w:after="0" w:afterAutospacing="0" w:line="300" w:lineRule="atLeast"/>
         <w:rPr>
-          <w:rFonts w:ascii="맑은 고딕" w:eastAsia="맑은 고딕" w:hAnsi="맑은 고딕" w:hint="eastAsia"/>
+          <w:rFonts w:ascii="맑은 고딕" w:eastAsia="맑은 고딕" w:hAnsi="맑은 고딕"/>
           <w:color w:val="000000"/>
           <w:sz w:val="22"/>
           <w:szCs w:val="22"/>
@@ -1037,7 +1192,7 @@
         <w:pStyle w:val="a3"/>
         <w:spacing w:before="0" w:beforeAutospacing="0" w:after="0" w:afterAutospacing="0" w:line="300" w:lineRule="atLeast"/>
         <w:rPr>
-          <w:rFonts w:ascii="맑은 고딕" w:eastAsia="맑은 고딕" w:hAnsi="맑은 고딕" w:hint="eastAsia"/>
+          <w:rFonts w:ascii="맑은 고딕" w:eastAsia="맑은 고딕" w:hAnsi="맑은 고딕"/>
           <w:color w:val="000000"/>
           <w:sz w:val="20"/>
           <w:szCs w:val="20"/>
@@ -1058,7 +1213,7 @@
         <w:pStyle w:val="a3"/>
         <w:spacing w:before="0" w:beforeAutospacing="0" w:after="0" w:afterAutospacing="0" w:line="300" w:lineRule="atLeast"/>
         <w:rPr>
-          <w:rFonts w:ascii="맑은 고딕" w:eastAsia="맑은 고딕" w:hAnsi="맑은 고딕" w:hint="eastAsia"/>
+          <w:rFonts w:ascii="맑은 고딕" w:eastAsia="맑은 고딕" w:hAnsi="맑은 고딕"/>
           <w:color w:val="000000"/>
           <w:sz w:val="22"/>
           <w:szCs w:val="22"/>
@@ -1070,7 +1225,7 @@
         <w:pStyle w:val="a3"/>
         <w:spacing w:before="0" w:beforeAutospacing="0" w:after="0" w:afterAutospacing="0" w:line="300" w:lineRule="atLeast"/>
         <w:rPr>
-          <w:rFonts w:ascii="맑은 고딕" w:eastAsia="맑은 고딕" w:hAnsi="맑은 고딕" w:hint="eastAsia"/>
+          <w:rFonts w:ascii="맑은 고딕" w:eastAsia="맑은 고딕" w:hAnsi="맑은 고딕"/>
           <w:color w:val="000000"/>
           <w:sz w:val="22"/>
           <w:szCs w:val="22"/>
@@ -1140,7 +1295,7 @@
         <w:pStyle w:val="a3"/>
         <w:spacing w:before="0" w:beforeAutospacing="0" w:after="0" w:afterAutospacing="0" w:line="300" w:lineRule="atLeast"/>
         <w:rPr>
-          <w:rFonts w:ascii="맑은 고딕" w:eastAsia="맑은 고딕" w:hAnsi="맑은 고딕" w:hint="eastAsia"/>
+          <w:rFonts w:ascii="맑은 고딕" w:eastAsia="맑은 고딕" w:hAnsi="맑은 고딕"/>
           <w:color w:val="000000"/>
           <w:sz w:val="22"/>
           <w:szCs w:val="22"/>
@@ -1152,7 +1307,7 @@
         <w:pStyle w:val="a3"/>
         <w:spacing w:before="0" w:beforeAutospacing="0" w:after="0" w:afterAutospacing="0" w:line="300" w:lineRule="atLeast"/>
         <w:rPr>
-          <w:rFonts w:ascii="맑은 고딕" w:eastAsia="맑은 고딕" w:hAnsi="맑은 고딕" w:hint="eastAsia"/>
+          <w:rFonts w:ascii="맑은 고딕" w:eastAsia="맑은 고딕" w:hAnsi="맑은 고딕"/>
           <w:color w:val="000000"/>
           <w:sz w:val="20"/>
           <w:szCs w:val="20"/>
@@ -1213,7 +1368,7 @@
         <w:pStyle w:val="a3"/>
         <w:spacing w:before="0" w:beforeAutospacing="0" w:after="0" w:afterAutospacing="0" w:line="300" w:lineRule="atLeast"/>
         <w:rPr>
-          <w:rFonts w:ascii="맑은 고딕" w:eastAsia="맑은 고딕" w:hAnsi="맑은 고딕" w:hint="eastAsia"/>
+          <w:rFonts w:ascii="맑은 고딕" w:eastAsia="맑은 고딕" w:hAnsi="맑은 고딕"/>
           <w:color w:val="000000"/>
           <w:sz w:val="22"/>
           <w:szCs w:val="22"/>
@@ -1225,7 +1380,7 @@
         <w:pStyle w:val="a3"/>
         <w:spacing w:before="0" w:beforeAutospacing="0" w:after="0" w:afterAutospacing="0" w:line="300" w:lineRule="atLeast"/>
         <w:rPr>
-          <w:rFonts w:ascii="맑은 고딕" w:eastAsia="맑은 고딕" w:hAnsi="맑은 고딕" w:hint="eastAsia"/>
+          <w:rFonts w:ascii="맑은 고딕" w:eastAsia="맑은 고딕" w:hAnsi="맑은 고딕"/>
           <w:color w:val="000000"/>
           <w:sz w:val="20"/>
           <w:szCs w:val="20"/>
@@ -1246,7 +1401,7 @@
         <w:pStyle w:val="a3"/>
         <w:spacing w:before="0" w:beforeAutospacing="0" w:after="0" w:afterAutospacing="0" w:line="300" w:lineRule="atLeast"/>
         <w:rPr>
-          <w:rFonts w:ascii="맑은 고딕" w:eastAsia="맑은 고딕" w:hAnsi="맑은 고딕" w:hint="eastAsia"/>
+          <w:rFonts w:ascii="맑은 고딕" w:eastAsia="맑은 고딕" w:hAnsi="맑은 고딕"/>
           <w:color w:val="000000"/>
           <w:sz w:val="22"/>
           <w:szCs w:val="22"/>
@@ -1258,7 +1413,7 @@
         <w:pStyle w:val="a3"/>
         <w:spacing w:before="0" w:beforeAutospacing="0" w:after="0" w:afterAutospacing="0" w:line="300" w:lineRule="atLeast"/>
         <w:rPr>
-          <w:rFonts w:ascii="맑은 고딕" w:eastAsia="맑은 고딕" w:hAnsi="맑은 고딕" w:hint="eastAsia"/>
+          <w:rFonts w:ascii="맑은 고딕" w:eastAsia="맑은 고딕" w:hAnsi="맑은 고딕"/>
           <w:color w:val="000000"/>
           <w:sz w:val="22"/>
           <w:szCs w:val="22"/>
@@ -1328,7 +1483,7 @@
         <w:pStyle w:val="a3"/>
         <w:spacing w:before="0" w:beforeAutospacing="0" w:after="0" w:afterAutospacing="0" w:line="300" w:lineRule="atLeast"/>
         <w:rPr>
-          <w:rFonts w:ascii="맑은 고딕" w:eastAsia="맑은 고딕" w:hAnsi="맑은 고딕" w:hint="eastAsia"/>
+          <w:rFonts w:ascii="맑은 고딕" w:eastAsia="맑은 고딕" w:hAnsi="맑은 고딕"/>
           <w:color w:val="000000"/>
           <w:sz w:val="22"/>
           <w:szCs w:val="22"/>
@@ -1340,7 +1495,7 @@
         <w:pStyle w:val="a3"/>
         <w:spacing w:before="0" w:beforeAutospacing="0" w:after="0" w:afterAutospacing="0" w:line="300" w:lineRule="atLeast"/>
         <w:rPr>
-          <w:rFonts w:ascii="맑은 고딕" w:eastAsia="맑은 고딕" w:hAnsi="맑은 고딕" w:hint="eastAsia"/>
+          <w:rFonts w:ascii="맑은 고딕" w:eastAsia="맑은 고딕" w:hAnsi="맑은 고딕"/>
           <w:color w:val="000000"/>
           <w:sz w:val="20"/>
           <w:szCs w:val="20"/>
@@ -1361,7 +1516,7 @@
         <w:pStyle w:val="a3"/>
         <w:spacing w:before="0" w:beforeAutospacing="0" w:after="0" w:afterAutospacing="0" w:line="300" w:lineRule="atLeast"/>
         <w:rPr>
-          <w:rFonts w:ascii="맑은 고딕" w:eastAsia="맑은 고딕" w:hAnsi="맑은 고딕" w:hint="eastAsia"/>
+          <w:rFonts w:ascii="맑은 고딕" w:eastAsia="맑은 고딕" w:hAnsi="맑은 고딕"/>
           <w:color w:val="000000"/>
           <w:sz w:val="22"/>
           <w:szCs w:val="22"/>
@@ -1373,7 +1528,7 @@
         <w:pStyle w:val="a3"/>
         <w:spacing w:before="0" w:beforeAutospacing="0" w:after="0" w:afterAutospacing="0" w:line="300" w:lineRule="atLeast"/>
         <w:rPr>
-          <w:rFonts w:ascii="맑은 고딕" w:eastAsia="맑은 고딕" w:hAnsi="맑은 고딕" w:hint="eastAsia"/>
+          <w:rFonts w:ascii="맑은 고딕" w:eastAsia="맑은 고딕" w:hAnsi="맑은 고딕"/>
           <w:color w:val="000000"/>
           <w:sz w:val="22"/>
           <w:szCs w:val="22"/>
@@ -1443,7 +1598,7 @@
         <w:pStyle w:val="a3"/>
         <w:spacing w:before="0" w:beforeAutospacing="0" w:after="0" w:afterAutospacing="0" w:line="300" w:lineRule="atLeast"/>
         <w:rPr>
-          <w:rFonts w:ascii="맑은 고딕" w:eastAsia="맑은 고딕" w:hAnsi="맑은 고딕" w:hint="eastAsia"/>
+          <w:rFonts w:ascii="맑은 고딕" w:eastAsia="맑은 고딕" w:hAnsi="맑은 고딕"/>
           <w:color w:val="000000"/>
           <w:sz w:val="22"/>
           <w:szCs w:val="22"/>
@@ -1455,7 +1610,7 @@
         <w:pStyle w:val="a3"/>
         <w:spacing w:before="0" w:beforeAutospacing="0" w:after="0" w:afterAutospacing="0" w:line="300" w:lineRule="atLeast"/>
         <w:rPr>
-          <w:rFonts w:ascii="맑은 고딕" w:eastAsia="맑은 고딕" w:hAnsi="맑은 고딕" w:hint="eastAsia"/>
+          <w:rFonts w:ascii="맑은 고딕" w:eastAsia="맑은 고딕" w:hAnsi="맑은 고딕"/>
           <w:color w:val="000000"/>
           <w:sz w:val="20"/>
           <w:szCs w:val="20"/>
@@ -1476,31 +1631,31 @@
         <w:pStyle w:val="a3"/>
         <w:spacing w:before="0" w:beforeAutospacing="0" w:after="0" w:afterAutospacing="0" w:line="300" w:lineRule="atLeast"/>
         <w:rPr>
-          <w:rFonts w:ascii="맑은 고딕" w:eastAsia="맑은 고딕" w:hAnsi="맑은 고딕" w:hint="eastAsia"/>
-          <w:color w:val="000000"/>
-          <w:sz w:val="20"/>
-          <w:szCs w:val="20"/>
-        </w:rPr>
-      </w:pPr>
-    </w:p>
-    <w:p>
-      <w:pPr>
-        <w:pStyle w:val="a3"/>
-        <w:spacing w:before="0" w:beforeAutospacing="0" w:after="0" w:afterAutospacing="0" w:line="300" w:lineRule="atLeast"/>
-        <w:rPr>
-          <w:rFonts w:ascii="맑은 고딕" w:eastAsia="맑은 고딕" w:hAnsi="맑은 고딕" w:hint="eastAsia"/>
-          <w:color w:val="000000"/>
-          <w:sz w:val="20"/>
-          <w:szCs w:val="20"/>
-        </w:rPr>
-      </w:pPr>
-    </w:p>
-    <w:p>
-      <w:pPr>
-        <w:pStyle w:val="a3"/>
-        <w:spacing w:before="0" w:beforeAutospacing="0" w:after="0" w:afterAutospacing="0" w:line="300" w:lineRule="atLeast"/>
-        <w:rPr>
-          <w:rFonts w:ascii="맑은 고딕" w:eastAsia="맑은 고딕" w:hAnsi="맑은 고딕" w:hint="eastAsia"/>
+          <w:rFonts w:ascii="맑은 고딕" w:eastAsia="맑은 고딕" w:hAnsi="맑은 고딕"/>
+          <w:color w:val="000000"/>
+          <w:sz w:val="20"/>
+          <w:szCs w:val="20"/>
+        </w:rPr>
+      </w:pPr>
+    </w:p>
+    <w:p>
+      <w:pPr>
+        <w:pStyle w:val="a3"/>
+        <w:spacing w:before="0" w:beforeAutospacing="0" w:after="0" w:afterAutospacing="0" w:line="300" w:lineRule="atLeast"/>
+        <w:rPr>
+          <w:rFonts w:ascii="맑은 고딕" w:eastAsia="맑은 고딕" w:hAnsi="맑은 고딕"/>
+          <w:color w:val="000000"/>
+          <w:sz w:val="20"/>
+          <w:szCs w:val="20"/>
+        </w:rPr>
+      </w:pPr>
+    </w:p>
+    <w:p>
+      <w:pPr>
+        <w:pStyle w:val="a3"/>
+        <w:spacing w:before="0" w:beforeAutospacing="0" w:after="0" w:afterAutospacing="0" w:line="300" w:lineRule="atLeast"/>
+        <w:rPr>
+          <w:rFonts w:ascii="맑은 고딕" w:eastAsia="맑은 고딕" w:hAnsi="맑은 고딕"/>
           <w:color w:val="000000"/>
           <w:sz w:val="20"/>
           <w:szCs w:val="20"/>
@@ -1528,533 +1683,529 @@
           <w:sz w:val="27"/>
           <w:szCs w:val="27"/>
         </w:rPr>
-        <w:t xml:space="preserve"> 한 후에 </w:t>
+        <w:t xml:space="preserve"> 한 후에 해야할 일</w:t>
+      </w:r>
+    </w:p>
+    <w:p>
+      <w:pPr>
+        <w:pStyle w:val="a3"/>
+        <w:spacing w:before="0" w:beforeAutospacing="0" w:after="0" w:afterAutospacing="0" w:line="300" w:lineRule="atLeast"/>
+        <w:rPr>
+          <w:rFonts w:ascii="맑은 고딕" w:eastAsia="맑은 고딕" w:hAnsi="맑은 고딕"/>
+          <w:color w:val="000000"/>
+          <w:sz w:val="20"/>
+          <w:szCs w:val="20"/>
+        </w:rPr>
+      </w:pPr>
+    </w:p>
+    <w:p>
+      <w:pPr>
+        <w:pStyle w:val="a3"/>
+        <w:spacing w:before="0" w:beforeAutospacing="0" w:after="0" w:afterAutospacing="0" w:line="300" w:lineRule="atLeast"/>
+        <w:rPr>
+          <w:rFonts w:ascii="맑은 고딕" w:eastAsia="맑은 고딕" w:hAnsi="맑은 고딕"/>
+          <w:color w:val="000000"/>
+          <w:sz w:val="20"/>
+          <w:szCs w:val="20"/>
+        </w:rPr>
+      </w:pPr>
+      <w:r>
+        <w:rPr>
+          <w:rFonts w:ascii="맑은 고딕" w:eastAsia="맑은 고딕" w:hAnsi="맑은 고딕" w:hint="eastAsia"/>
+          <w:color w:val="000000"/>
+          <w:sz w:val="21"/>
+          <w:szCs w:val="21"/>
+        </w:rPr>
+        <w:t xml:space="preserve">1. </w:t>
       </w:r>
       <w:proofErr w:type="spellStart"/>
+      <w:r>
+        <w:rPr>
+          <w:rFonts w:ascii="맑은 고딕" w:eastAsia="맑은 고딕" w:hAnsi="맑은 고딕" w:hint="eastAsia"/>
+          <w:color w:val="000000"/>
+          <w:sz w:val="21"/>
+          <w:szCs w:val="21"/>
+        </w:rPr>
+        <w:t>익스포트한</w:t>
+      </w:r>
+      <w:proofErr w:type="spellEnd"/>
+      <w:r>
+        <w:rPr>
+          <w:rFonts w:ascii="맑은 고딕" w:eastAsia="맑은 고딕" w:hAnsi="맑은 고딕" w:hint="eastAsia"/>
+          <w:color w:val="000000"/>
+          <w:sz w:val="21"/>
+          <w:szCs w:val="21"/>
+        </w:rPr>
+        <w:t xml:space="preserve"> 파일을 Notepad++ 에디터로 연다.</w:t>
+      </w:r>
+    </w:p>
+    <w:p>
+      <w:pPr>
+        <w:pStyle w:val="a3"/>
+        <w:spacing w:before="0" w:beforeAutospacing="0" w:after="0" w:afterAutospacing="0" w:line="300" w:lineRule="atLeast"/>
+        <w:rPr>
+          <w:rFonts w:ascii="맑은 고딕" w:eastAsia="맑은 고딕" w:hAnsi="맑은 고딕"/>
+          <w:color w:val="000000"/>
+          <w:sz w:val="20"/>
+          <w:szCs w:val="20"/>
+        </w:rPr>
+      </w:pPr>
+    </w:p>
+    <w:p>
+      <w:pPr>
+        <w:pStyle w:val="a3"/>
+        <w:spacing w:before="0" w:beforeAutospacing="0" w:after="0" w:afterAutospacing="0" w:line="300" w:lineRule="atLeast"/>
+        <w:rPr>
+          <w:rFonts w:ascii="맑은 고딕" w:eastAsia="맑은 고딕" w:hAnsi="맑은 고딕"/>
+          <w:color w:val="000000"/>
+          <w:sz w:val="20"/>
+          <w:szCs w:val="20"/>
+        </w:rPr>
+      </w:pPr>
+      <w:r>
+        <w:rPr>
+          <w:rFonts w:ascii="맑은 고딕" w:eastAsia="맑은 고딕" w:hAnsi="맑은 고딕" w:hint="eastAsia"/>
+          <w:color w:val="000000"/>
+          <w:sz w:val="21"/>
+          <w:szCs w:val="21"/>
+        </w:rPr>
+        <w:t>2. 저장영역부분을 보면 TABLESPACE "EZEKP2017" 로 되어있는데 이것을 TABLESPACE "USERS" </w:t>
+      </w:r>
+      <w:proofErr w:type="spellStart"/>
+      <w:r>
+        <w:rPr>
+          <w:rFonts w:ascii="맑은 고딕" w:eastAsia="맑은 고딕" w:hAnsi="맑은 고딕" w:hint="eastAsia"/>
+          <w:color w:val="000000"/>
+          <w:sz w:val="21"/>
+          <w:szCs w:val="21"/>
+        </w:rPr>
+        <w:t>로변경해</w:t>
+      </w:r>
+      <w:proofErr w:type="spellEnd"/>
+      <w:r>
+        <w:rPr>
+          <w:rFonts w:ascii="맑은 고딕" w:eastAsia="맑은 고딕" w:hAnsi="맑은 고딕" w:hint="eastAsia"/>
+          <w:color w:val="000000"/>
+          <w:sz w:val="21"/>
+          <w:szCs w:val="21"/>
+        </w:rPr>
+        <w:t xml:space="preserve"> 주어야 한다. </w:t>
+      </w:r>
+    </w:p>
+    <w:p>
+      <w:pPr>
+        <w:pStyle w:val="a3"/>
+        <w:spacing w:before="0" w:beforeAutospacing="0" w:after="0" w:afterAutospacing="0" w:line="300" w:lineRule="atLeast"/>
+        <w:rPr>
+          <w:rFonts w:ascii="맑은 고딕" w:eastAsia="맑은 고딕" w:hAnsi="맑은 고딕"/>
+          <w:color w:val="000000"/>
+          <w:sz w:val="20"/>
+          <w:szCs w:val="20"/>
+        </w:rPr>
+      </w:pPr>
+    </w:p>
+    <w:p>
+      <w:pPr>
+        <w:pStyle w:val="a3"/>
+        <w:spacing w:before="0" w:beforeAutospacing="0" w:after="0" w:afterAutospacing="0" w:line="300" w:lineRule="atLeast"/>
+        <w:rPr>
+          <w:rFonts w:ascii="맑은 고딕" w:eastAsia="맑은 고딕" w:hAnsi="맑은 고딕"/>
+          <w:color w:val="000000"/>
+          <w:sz w:val="20"/>
+          <w:szCs w:val="20"/>
+        </w:rPr>
+      </w:pPr>
+      <w:r>
+        <w:rPr>
+          <w:rFonts w:ascii="맑은 고딕" w:eastAsia="맑은 고딕" w:hAnsi="맑은 고딕" w:hint="eastAsia"/>
+          <w:color w:val="000000"/>
+          <w:sz w:val="21"/>
+          <w:szCs w:val="21"/>
+        </w:rPr>
+        <w:lastRenderedPageBreak/>
+        <w:t>3.  SEQUENCE </w:t>
+      </w:r>
+      <w:proofErr w:type="spellStart"/>
+      <w:r>
+        <w:rPr>
+          <w:rFonts w:ascii="맑은 고딕" w:eastAsia="맑은 고딕" w:hAnsi="맑은 고딕" w:hint="eastAsia"/>
+          <w:color w:val="000000"/>
+          <w:sz w:val="21"/>
+          <w:szCs w:val="21"/>
+        </w:rPr>
+        <w:t>생성부분에</w:t>
+      </w:r>
+      <w:proofErr w:type="spellEnd"/>
+      <w:r>
+        <w:rPr>
+          <w:rFonts w:ascii="맑은 고딕" w:eastAsia="맑은 고딕" w:hAnsi="맑은 고딕" w:hint="eastAsia"/>
+          <w:color w:val="000000"/>
+          <w:sz w:val="21"/>
+          <w:szCs w:val="21"/>
+        </w:rPr>
+        <w:t> START WITH </w:t>
+      </w:r>
+      <w:proofErr w:type="spellStart"/>
+      <w:r>
+        <w:rPr>
+          <w:rFonts w:ascii="맑은 고딕" w:eastAsia="맑은 고딕" w:hAnsi="맑은 고딕" w:hint="eastAsia"/>
+          <w:color w:val="000000"/>
+          <w:sz w:val="21"/>
+          <w:szCs w:val="21"/>
+        </w:rPr>
+        <w:t>뒤의숫자는현재기준으로되어있으므로파일에</w:t>
+      </w:r>
+      <w:proofErr w:type="spellEnd"/>
+      <w:r>
+        <w:rPr>
+          <w:rFonts w:ascii="맑은 고딕" w:eastAsia="맑은 고딕" w:hAnsi="맑은 고딕" w:hint="eastAsia"/>
+          <w:color w:val="000000"/>
+          <w:sz w:val="21"/>
+          <w:szCs w:val="21"/>
+        </w:rPr>
+        <w:t xml:space="preserve"> </w:t>
+      </w:r>
+      <w:proofErr w:type="spellStart"/>
+      <w:r>
+        <w:rPr>
+          <w:rFonts w:ascii="맑은 고딕" w:eastAsia="맑은 고딕" w:hAnsi="맑은 고딕" w:hint="eastAsia"/>
+          <w:color w:val="000000"/>
+          <w:sz w:val="21"/>
+          <w:szCs w:val="21"/>
+        </w:rPr>
+        <w:t>들어갈것은</w:t>
+      </w:r>
+      <w:proofErr w:type="spellEnd"/>
+      <w:r>
+        <w:rPr>
+          <w:rFonts w:ascii="맑은 고딕" w:eastAsia="맑은 고딕" w:hAnsi="맑은 고딕" w:hint="eastAsia"/>
+          <w:color w:val="000000"/>
+          <w:sz w:val="21"/>
+          <w:szCs w:val="21"/>
+        </w:rPr>
+        <w:t> 1로바꾸어주어야한다.  </w:t>
+      </w:r>
+      <w:proofErr w:type="spellStart"/>
+      <w:r>
+        <w:rPr>
+          <w:rFonts w:ascii="맑은 고딕" w:eastAsia="맑은 고딕" w:hAnsi="맑은 고딕" w:hint="eastAsia"/>
+          <w:color w:val="000000"/>
+          <w:sz w:val="21"/>
+          <w:szCs w:val="21"/>
+        </w:rPr>
+        <w:t>찾기옵션에정규식찾기를통해</w:t>
+      </w:r>
+      <w:proofErr w:type="spellEnd"/>
+      <w:r>
+        <w:rPr>
+          <w:rFonts w:ascii="맑은 고딕" w:eastAsia="맑은 고딕" w:hAnsi="맑은 고딕" w:hint="eastAsia"/>
+          <w:color w:val="000000"/>
+          <w:sz w:val="21"/>
+          <w:szCs w:val="21"/>
+        </w:rPr>
+        <w:t> START WITH</w:t>
+      </w:r>
+      <w:r>
+        <w:rPr>
+          <w:rFonts w:ascii="맑은 고딕" w:eastAsia="맑은 고딕" w:hAnsi="맑은 고딕" w:hint="eastAsia"/>
+          <w:color w:val="000000"/>
+          <w:sz w:val="21"/>
+          <w:szCs w:val="21"/>
+          <w:lang w:val="x-none"/>
+        </w:rPr>
+        <w:t> \d+</w:t>
+      </w:r>
+      <w:r>
+        <w:rPr>
+          <w:rFonts w:ascii="맑은 고딕" w:eastAsia="맑은 고딕" w:hAnsi="맑은 고딕" w:hint="eastAsia"/>
+          <w:color w:val="000000"/>
+          <w:sz w:val="21"/>
+          <w:szCs w:val="21"/>
+        </w:rPr>
+        <w:t xml:space="preserve"> 정규식을 이용하여 START </w:t>
+      </w:r>
+      <w:proofErr w:type="gramStart"/>
+      <w:r>
+        <w:rPr>
+          <w:rFonts w:ascii="맑은 고딕" w:eastAsia="맑은 고딕" w:hAnsi="맑은 고딕" w:hint="eastAsia"/>
+          <w:color w:val="000000"/>
+          <w:sz w:val="21"/>
+          <w:szCs w:val="21"/>
+        </w:rPr>
+        <w:t>WITH  </w:t>
+      </w:r>
+      <w:proofErr w:type="spellStart"/>
+      <w:r>
+        <w:rPr>
+          <w:rFonts w:ascii="맑은 고딕" w:eastAsia="맑은 고딕" w:hAnsi="맑은 고딕" w:hint="eastAsia"/>
+          <w:color w:val="000000"/>
+          <w:sz w:val="21"/>
+          <w:szCs w:val="21"/>
+        </w:rPr>
+        <w:t>뒤의값을</w:t>
+      </w:r>
+      <w:proofErr w:type="spellEnd"/>
+      <w:proofErr w:type="gramEnd"/>
+      <w:r>
+        <w:rPr>
+          <w:rFonts w:ascii="맑은 고딕" w:eastAsia="맑은 고딕" w:hAnsi="맑은 고딕" w:hint="eastAsia"/>
+          <w:color w:val="000000"/>
+          <w:sz w:val="21"/>
+          <w:szCs w:val="21"/>
+        </w:rPr>
+        <w:t> 1로바꿔준다.</w:t>
+      </w:r>
+    </w:p>
+    <w:p>
+      <w:pPr>
+        <w:pStyle w:val="a3"/>
+        <w:spacing w:before="0" w:beforeAutospacing="0" w:after="0" w:afterAutospacing="0" w:line="300" w:lineRule="atLeast"/>
+        <w:rPr>
+          <w:rFonts w:ascii="맑은 고딕" w:eastAsia="맑은 고딕" w:hAnsi="맑은 고딕"/>
+          <w:color w:val="000000"/>
+          <w:sz w:val="20"/>
+          <w:szCs w:val="20"/>
+        </w:rPr>
+      </w:pPr>
+    </w:p>
+    <w:p>
+      <w:pPr>
+        <w:pStyle w:val="a3"/>
+        <w:spacing w:before="0" w:beforeAutospacing="0" w:after="0" w:afterAutospacing="0" w:line="300" w:lineRule="atLeast"/>
+        <w:rPr>
+          <w:rFonts w:ascii="맑은 고딕" w:eastAsia="맑은 고딕" w:hAnsi="맑은 고딕"/>
+          <w:color w:val="000000"/>
+          <w:sz w:val="20"/>
+          <w:szCs w:val="20"/>
+        </w:rPr>
+      </w:pPr>
+      <w:r>
+        <w:rPr>
+          <w:rFonts w:ascii="맑은 고딕" w:eastAsia="맑은 고딕" w:hAnsi="맑은 고딕" w:hint="eastAsia"/>
+          <w:color w:val="000000"/>
+          <w:sz w:val="21"/>
+          <w:szCs w:val="21"/>
+        </w:rPr>
+        <w:t xml:space="preserve">4. 이전에는 시퀀스 </w:t>
+      </w:r>
+      <w:proofErr w:type="spellStart"/>
+      <w:r>
+        <w:rPr>
+          <w:rFonts w:ascii="맑은 고딕" w:eastAsia="맑은 고딕" w:hAnsi="맑은 고딕" w:hint="eastAsia"/>
+          <w:color w:val="000000"/>
+          <w:sz w:val="21"/>
+          <w:szCs w:val="21"/>
+        </w:rPr>
+        <w:t>생성문을</w:t>
+      </w:r>
+      <w:proofErr w:type="spellEnd"/>
+      <w:r>
+        <w:rPr>
+          <w:rFonts w:ascii="맑은 고딕" w:eastAsia="맑은 고딕" w:hAnsi="맑은 고딕" w:hint="eastAsia"/>
+          <w:color w:val="000000"/>
+          <w:sz w:val="21"/>
+          <w:szCs w:val="21"/>
+        </w:rPr>
+        <w:t xml:space="preserve"> 보면 맨 끝에, NOCYCLE뒤에 NOKEEP NOSCALE GLOBAL 옵션이 붙었으나, 11g버전부터는 사용하지 않으므로 붙이지 않는다.</w:t>
+      </w:r>
+    </w:p>
+    <w:p>
+      <w:pPr>
+        <w:pStyle w:val="a3"/>
+        <w:spacing w:before="0" w:beforeAutospacing="0" w:after="0" w:afterAutospacing="0" w:line="300" w:lineRule="atLeast"/>
+        <w:rPr>
+          <w:rFonts w:ascii="맑은 고딕" w:eastAsia="맑은 고딕" w:hAnsi="맑은 고딕"/>
+          <w:color w:val="000000"/>
+          <w:sz w:val="20"/>
+          <w:szCs w:val="20"/>
+        </w:rPr>
+      </w:pPr>
+      <w:r>
+        <w:rPr>
+          <w:rFonts w:ascii="맑은 고딕" w:eastAsia="맑은 고딕" w:hAnsi="맑은 고딕" w:hint="eastAsia"/>
+          <w:color w:val="000000"/>
+          <w:sz w:val="21"/>
+          <w:szCs w:val="21"/>
+        </w:rPr>
+        <w:t>   (</w:t>
+      </w:r>
+      <w:proofErr w:type="gramStart"/>
+      <w:r>
+        <w:rPr>
+          <w:rFonts w:ascii="맑은 고딕" w:eastAsia="맑은 고딕" w:hAnsi="맑은 고딕" w:hint="eastAsia"/>
+          <w:color w:val="000000"/>
+          <w:sz w:val="21"/>
+          <w:szCs w:val="21"/>
+        </w:rPr>
+        <w:t>참고 :</w:t>
+      </w:r>
+      <w:proofErr w:type="gramEnd"/>
+      <w:r>
+        <w:rPr>
+          <w:rFonts w:ascii="맑은 고딕" w:eastAsia="맑은 고딕" w:hAnsi="맑은 고딕" w:hint="eastAsia"/>
+          <w:color w:val="000000"/>
+          <w:sz w:val="21"/>
+          <w:szCs w:val="21"/>
+        </w:rPr>
+        <w:t xml:space="preserve"> NOKEEP옵션-</w:t>
+      </w:r>
+      <w:proofErr w:type="spellStart"/>
+      <w:r>
+        <w:rPr>
+          <w:rFonts w:ascii="맑은 고딕" w:eastAsia="맑은 고딕" w:hAnsi="맑은 고딕" w:hint="eastAsia"/>
+          <w:color w:val="000000"/>
+          <w:sz w:val="21"/>
+          <w:szCs w:val="21"/>
+        </w:rPr>
+        <w:t>프로그램테스트혹은성능시험을하는동안현재값보호하지</w:t>
+      </w:r>
+      <w:proofErr w:type="spellEnd"/>
+      <w:r>
+        <w:rPr>
+          <w:rFonts w:ascii="맑은 고딕" w:eastAsia="맑은 고딕" w:hAnsi="맑은 고딕" w:hint="eastAsia"/>
+          <w:color w:val="000000"/>
+          <w:sz w:val="21"/>
+          <w:szCs w:val="21"/>
+        </w:rPr>
+        <w:t xml:space="preserve"> 않음. NOSCALE-SCALE옵션을 사용하게 되면 시퀀스 값 앞에 3자리 세션오프셋과 3자리 인스턴스 오프셋</w:t>
+      </w:r>
+      <w:proofErr w:type="gramStart"/>
+      <w:r>
+        <w:rPr>
+          <w:rFonts w:ascii="맑은 고딕" w:eastAsia="맑은 고딕" w:hAnsi="맑은 고딕" w:hint="eastAsia"/>
+          <w:color w:val="000000"/>
+          <w:sz w:val="21"/>
+          <w:szCs w:val="21"/>
+        </w:rPr>
+        <w:t>,총</w:t>
+      </w:r>
+      <w:proofErr w:type="gramEnd"/>
+      <w:r>
+        <w:rPr>
+          <w:rFonts w:ascii="맑은 고딕" w:eastAsia="맑은 고딕" w:hAnsi="맑은 고딕" w:hint="eastAsia"/>
+          <w:color w:val="000000"/>
+          <w:sz w:val="21"/>
+          <w:szCs w:val="21"/>
+        </w:rPr>
+        <w:t xml:space="preserve"> 6자리의 접두사가 붙는데 이것을 사용하지 </w:t>
+      </w:r>
+      <w:proofErr w:type="spellStart"/>
+      <w:r>
+        <w:rPr>
+          <w:rFonts w:ascii="맑은 고딕" w:eastAsia="맑은 고딕" w:hAnsi="맑은 고딕" w:hint="eastAsia"/>
+          <w:color w:val="000000"/>
+          <w:sz w:val="21"/>
+          <w:szCs w:val="21"/>
+        </w:rPr>
+        <w:t>않는다는것</w:t>
+      </w:r>
+      <w:proofErr w:type="spellEnd"/>
+      <w:r>
+        <w:rPr>
+          <w:rFonts w:ascii="맑은 고딕" w:eastAsia="맑은 고딕" w:hAnsi="맑은 고딕" w:hint="eastAsia"/>
+          <w:color w:val="000000"/>
+          <w:sz w:val="21"/>
+          <w:szCs w:val="21"/>
+        </w:rPr>
+        <w:t>. GLOBAL-</w:t>
+      </w:r>
+      <w:proofErr w:type="spellStart"/>
+      <w:r>
+        <w:rPr>
+          <w:rFonts w:ascii="맑은 고딕" w:eastAsia="맑은 고딕" w:hAnsi="맑은 고딕" w:hint="eastAsia"/>
+          <w:color w:val="000000"/>
+          <w:sz w:val="21"/>
+          <w:szCs w:val="21"/>
+        </w:rPr>
+        <w:t>해당시퀀스를여러사용자가사용가능하다는</w:t>
+      </w:r>
+      <w:proofErr w:type="spellEnd"/>
+      <w:r>
+        <w:rPr>
+          <w:rFonts w:ascii="맑은 고딕" w:eastAsia="맑은 고딕" w:hAnsi="맑은 고딕" w:hint="eastAsia"/>
+          <w:color w:val="000000"/>
+          <w:sz w:val="21"/>
+          <w:szCs w:val="21"/>
+        </w:rPr>
+        <w:t xml:space="preserve"> 것.)</w:t>
+      </w:r>
+    </w:p>
+    <w:p>
+      <w:pPr>
+        <w:pStyle w:val="a3"/>
+        <w:spacing w:before="0" w:beforeAutospacing="0" w:after="0" w:afterAutospacing="0" w:line="300" w:lineRule="atLeast"/>
+        <w:rPr>
+          <w:rFonts w:ascii="맑은 고딕" w:eastAsia="맑은 고딕" w:hAnsi="맑은 고딕"/>
+          <w:color w:val="000000"/>
+          <w:sz w:val="20"/>
+          <w:szCs w:val="20"/>
+        </w:rPr>
+      </w:pPr>
+    </w:p>
+    <w:p>
+      <w:pPr>
+        <w:pStyle w:val="a3"/>
+        <w:spacing w:before="0" w:beforeAutospacing="0" w:after="0" w:afterAutospacing="0" w:line="300" w:lineRule="atLeast"/>
+        <w:rPr>
+          <w:rFonts w:ascii="맑은 고딕" w:eastAsia="맑은 고딕" w:hAnsi="맑은 고딕"/>
+          <w:color w:val="000000"/>
+          <w:sz w:val="20"/>
+          <w:szCs w:val="20"/>
+        </w:rPr>
+      </w:pPr>
+    </w:p>
+    <w:p>
+      <w:pPr>
+        <w:pStyle w:val="a3"/>
+        <w:spacing w:before="0" w:beforeAutospacing="0" w:after="0" w:afterAutospacing="0" w:line="300" w:lineRule="atLeast"/>
+        <w:rPr>
+          <w:rFonts w:ascii="맑은 고딕" w:eastAsia="맑은 고딕" w:hAnsi="맑은 고딕"/>
+          <w:color w:val="000000"/>
+          <w:sz w:val="20"/>
+          <w:szCs w:val="20"/>
+        </w:rPr>
+      </w:pPr>
+    </w:p>
+    <w:p>
+      <w:pPr>
+        <w:pStyle w:val="a3"/>
+        <w:spacing w:before="0" w:beforeAutospacing="0" w:after="0" w:afterAutospacing="0" w:line="300" w:lineRule="atLeast"/>
+        <w:rPr>
+          <w:rFonts w:ascii="맑은 고딕" w:eastAsia="맑은 고딕" w:hAnsi="맑은 고딕"/>
+          <w:color w:val="000000"/>
+          <w:sz w:val="20"/>
+          <w:szCs w:val="20"/>
+        </w:rPr>
+      </w:pPr>
+      <w:r>
+        <w:rPr>
+          <w:rFonts w:ascii="맑은 고딕" w:eastAsia="맑은 고딕" w:hAnsi="맑은 고딕" w:hint="eastAsia"/>
+          <w:color w:val="000000"/>
+          <w:sz w:val="20"/>
+          <w:szCs w:val="20"/>
+        </w:rPr>
+        <w:t>위의 4번의 </w:t>
+      </w:r>
       <w:r>
         <w:rPr>
           <w:rFonts w:ascii="맑은 고딕" w:eastAsia="맑은 고딕" w:hAnsi="맑은 고딕" w:hint="eastAsia"/>
           <w:b/>
           <w:bCs/>
           <w:color w:val="000000"/>
-          <w:sz w:val="27"/>
-          <w:szCs w:val="27"/>
-        </w:rPr>
-        <w:t>해야할</w:t>
-      </w:r>
-      <w:proofErr w:type="spellEnd"/>
+        </w:rPr>
+        <w:t xml:space="preserve">DDL </w:t>
+      </w:r>
+      <w:proofErr w:type="spellStart"/>
       <w:r>
         <w:rPr>
           <w:rFonts w:ascii="맑은 고딕" w:eastAsia="맑은 고딕" w:hAnsi="맑은 고딕" w:hint="eastAsia"/>
           <w:b/>
           <w:bCs/>
           <w:color w:val="000000"/>
-          <w:sz w:val="27"/>
-          <w:szCs w:val="27"/>
-        </w:rPr>
-        <w:t xml:space="preserve"> 일</w:t>
-      </w:r>
-    </w:p>
-    <w:p>
-      <w:pPr>
-        <w:pStyle w:val="a3"/>
-        <w:spacing w:before="0" w:beforeAutospacing="0" w:after="0" w:afterAutospacing="0" w:line="300" w:lineRule="atLeast"/>
-        <w:rPr>
-          <w:rFonts w:ascii="맑은 고딕" w:eastAsia="맑은 고딕" w:hAnsi="맑은 고딕" w:hint="eastAsia"/>
-          <w:color w:val="000000"/>
-          <w:sz w:val="20"/>
-          <w:szCs w:val="20"/>
-        </w:rPr>
-      </w:pPr>
-    </w:p>
-    <w:p>
-      <w:pPr>
-        <w:pStyle w:val="a3"/>
-        <w:spacing w:before="0" w:beforeAutospacing="0" w:after="0" w:afterAutospacing="0" w:line="300" w:lineRule="atLeast"/>
-        <w:rPr>
-          <w:rFonts w:ascii="맑은 고딕" w:eastAsia="맑은 고딕" w:hAnsi="맑은 고딕" w:hint="eastAsia"/>
-          <w:color w:val="000000"/>
-          <w:sz w:val="20"/>
-          <w:szCs w:val="20"/>
-        </w:rPr>
-      </w:pPr>
-      <w:r>
-        <w:rPr>
-          <w:rFonts w:ascii="맑은 고딕" w:eastAsia="맑은 고딕" w:hAnsi="맑은 고딕" w:hint="eastAsia"/>
-          <w:color w:val="000000"/>
-          <w:sz w:val="21"/>
-          <w:szCs w:val="21"/>
-        </w:rPr>
-        <w:t xml:space="preserve">1. </w:t>
-      </w:r>
-      <w:proofErr w:type="spellStart"/>
-      <w:r>
-        <w:rPr>
-          <w:rFonts w:ascii="맑은 고딕" w:eastAsia="맑은 고딕" w:hAnsi="맑은 고딕" w:hint="eastAsia"/>
-          <w:color w:val="000000"/>
-          <w:sz w:val="21"/>
-          <w:szCs w:val="21"/>
-        </w:rPr>
-        <w:t>익스포트한</w:t>
+        </w:rPr>
+        <w:t>익스포트</w:t>
       </w:r>
       <w:proofErr w:type="spellEnd"/>
-      <w:r>
-        <w:rPr>
-          <w:rFonts w:ascii="맑은 고딕" w:eastAsia="맑은 고딕" w:hAnsi="맑은 고딕" w:hint="eastAsia"/>
-          <w:color w:val="000000"/>
-          <w:sz w:val="21"/>
-          <w:szCs w:val="21"/>
-        </w:rPr>
-        <w:t xml:space="preserve"> 파일을 Notepad++ 에디터로 연다.</w:t>
-      </w:r>
-    </w:p>
-    <w:p>
-      <w:pPr>
-        <w:pStyle w:val="a3"/>
-        <w:spacing w:before="0" w:beforeAutospacing="0" w:after="0" w:afterAutospacing="0" w:line="300" w:lineRule="atLeast"/>
-        <w:rPr>
-          <w:rFonts w:ascii="맑은 고딕" w:eastAsia="맑은 고딕" w:hAnsi="맑은 고딕" w:hint="eastAsia"/>
-          <w:color w:val="000000"/>
-          <w:sz w:val="20"/>
-          <w:szCs w:val="20"/>
-        </w:rPr>
-      </w:pPr>
-    </w:p>
-    <w:p>
-      <w:pPr>
-        <w:pStyle w:val="a3"/>
-        <w:spacing w:before="0" w:beforeAutospacing="0" w:after="0" w:afterAutospacing="0" w:line="300" w:lineRule="atLeast"/>
-        <w:rPr>
-          <w:rFonts w:ascii="맑은 고딕" w:eastAsia="맑은 고딕" w:hAnsi="맑은 고딕" w:hint="eastAsia"/>
-          <w:color w:val="000000"/>
-          <w:sz w:val="20"/>
-          <w:szCs w:val="20"/>
-        </w:rPr>
-      </w:pPr>
-      <w:r>
-        <w:rPr>
-          <w:rFonts w:ascii="맑은 고딕" w:eastAsia="맑은 고딕" w:hAnsi="맑은 고딕" w:hint="eastAsia"/>
-          <w:color w:val="000000"/>
-          <w:sz w:val="21"/>
-          <w:szCs w:val="21"/>
-        </w:rPr>
-        <w:t>2. 저장영역부분을 보면 TABLESPACE "EZEKP2017" 로 되어있는데 이것을 TABLESPACE "USERS" </w:t>
-      </w:r>
-      <w:proofErr w:type="spellStart"/>
-      <w:r>
-        <w:rPr>
-          <w:rFonts w:ascii="맑은 고딕" w:eastAsia="맑은 고딕" w:hAnsi="맑은 고딕" w:hint="eastAsia"/>
-          <w:color w:val="000000"/>
-          <w:sz w:val="21"/>
-          <w:szCs w:val="21"/>
-        </w:rPr>
-        <w:t>로변경해</w:t>
-      </w:r>
-      <w:proofErr w:type="spellEnd"/>
-      <w:r>
-        <w:rPr>
-          <w:rFonts w:ascii="맑은 고딕" w:eastAsia="맑은 고딕" w:hAnsi="맑은 고딕" w:hint="eastAsia"/>
-          <w:color w:val="000000"/>
-          <w:sz w:val="21"/>
-          <w:szCs w:val="21"/>
-        </w:rPr>
-        <w:t xml:space="preserve"> 주어야 한다. </w:t>
-      </w:r>
-    </w:p>
-    <w:p>
-      <w:pPr>
-        <w:pStyle w:val="a3"/>
-        <w:spacing w:before="0" w:beforeAutospacing="0" w:after="0" w:afterAutospacing="0" w:line="300" w:lineRule="atLeast"/>
-        <w:rPr>
-          <w:rFonts w:ascii="맑은 고딕" w:eastAsia="맑은 고딕" w:hAnsi="맑은 고딕" w:hint="eastAsia"/>
-          <w:color w:val="000000"/>
-          <w:sz w:val="20"/>
-          <w:szCs w:val="20"/>
-        </w:rPr>
-      </w:pPr>
-    </w:p>
-    <w:p>
-      <w:pPr>
-        <w:pStyle w:val="a3"/>
-        <w:spacing w:before="0" w:beforeAutospacing="0" w:after="0" w:afterAutospacing="0" w:line="300" w:lineRule="atLeast"/>
-        <w:rPr>
-          <w:rFonts w:ascii="맑은 고딕" w:eastAsia="맑은 고딕" w:hAnsi="맑은 고딕" w:hint="eastAsia"/>
-          <w:color w:val="000000"/>
-          <w:sz w:val="20"/>
-          <w:szCs w:val="20"/>
-        </w:rPr>
-      </w:pPr>
-      <w:r>
-        <w:rPr>
-          <w:rFonts w:ascii="맑은 고딕" w:eastAsia="맑은 고딕" w:hAnsi="맑은 고딕" w:hint="eastAsia"/>
-          <w:color w:val="000000"/>
-          <w:sz w:val="21"/>
-          <w:szCs w:val="21"/>
-        </w:rPr>
-        <w:lastRenderedPageBreak/>
-        <w:t>3.  SEQUENCE 생성부분에 START WITH </w:t>
-      </w:r>
-      <w:proofErr w:type="spellStart"/>
-      <w:r>
-        <w:rPr>
-          <w:rFonts w:ascii="맑은 고딕" w:eastAsia="맑은 고딕" w:hAnsi="맑은 고딕" w:hint="eastAsia"/>
-          <w:color w:val="000000"/>
-          <w:sz w:val="21"/>
-          <w:szCs w:val="21"/>
-        </w:rPr>
-        <w:t>뒤의숫자는현재기준으로되어있으므로파일에</w:t>
-      </w:r>
-      <w:proofErr w:type="spellEnd"/>
-      <w:r>
-        <w:rPr>
-          <w:rFonts w:ascii="맑은 고딕" w:eastAsia="맑은 고딕" w:hAnsi="맑은 고딕" w:hint="eastAsia"/>
-          <w:color w:val="000000"/>
-          <w:sz w:val="21"/>
-          <w:szCs w:val="21"/>
-        </w:rPr>
-        <w:t xml:space="preserve"> </w:t>
-      </w:r>
-      <w:proofErr w:type="spellStart"/>
-      <w:r>
-        <w:rPr>
-          <w:rFonts w:ascii="맑은 고딕" w:eastAsia="맑은 고딕" w:hAnsi="맑은 고딕" w:hint="eastAsia"/>
-          <w:color w:val="000000"/>
-          <w:sz w:val="21"/>
-          <w:szCs w:val="21"/>
-        </w:rPr>
-        <w:t>들어갈것은</w:t>
-      </w:r>
-      <w:proofErr w:type="spellEnd"/>
-      <w:r>
-        <w:rPr>
-          <w:rFonts w:ascii="맑은 고딕" w:eastAsia="맑은 고딕" w:hAnsi="맑은 고딕" w:hint="eastAsia"/>
-          <w:color w:val="000000"/>
-          <w:sz w:val="21"/>
-          <w:szCs w:val="21"/>
-        </w:rPr>
-        <w:t> 1로바꾸어주어야한다.  </w:t>
-      </w:r>
-      <w:proofErr w:type="spellStart"/>
-      <w:r>
-        <w:rPr>
-          <w:rFonts w:ascii="맑은 고딕" w:eastAsia="맑은 고딕" w:hAnsi="맑은 고딕" w:hint="eastAsia"/>
-          <w:color w:val="000000"/>
-          <w:sz w:val="21"/>
-          <w:szCs w:val="21"/>
-        </w:rPr>
-        <w:t>찾기옵션에정규식찾기를통해</w:t>
-      </w:r>
-      <w:proofErr w:type="spellEnd"/>
-      <w:r>
-        <w:rPr>
-          <w:rFonts w:ascii="맑은 고딕" w:eastAsia="맑은 고딕" w:hAnsi="맑은 고딕" w:hint="eastAsia"/>
-          <w:color w:val="000000"/>
-          <w:sz w:val="21"/>
-          <w:szCs w:val="21"/>
-        </w:rPr>
-        <w:t> START WITH</w:t>
-      </w:r>
-      <w:r>
-        <w:rPr>
-          <w:rFonts w:ascii="맑은 고딕" w:eastAsia="맑은 고딕" w:hAnsi="맑은 고딕" w:hint="eastAsia"/>
-          <w:color w:val="000000"/>
-          <w:sz w:val="21"/>
-          <w:szCs w:val="21"/>
-          <w:lang w:val="x-none"/>
-        </w:rPr>
-        <w:t> \d+</w:t>
-      </w:r>
-      <w:r>
-        <w:rPr>
-          <w:rFonts w:ascii="맑은 고딕" w:eastAsia="맑은 고딕" w:hAnsi="맑은 고딕" w:hint="eastAsia"/>
-          <w:color w:val="000000"/>
-          <w:sz w:val="21"/>
-          <w:szCs w:val="21"/>
-        </w:rPr>
-        <w:t xml:space="preserve"> 정규식을 이용하여 START </w:t>
-      </w:r>
-      <w:proofErr w:type="gramStart"/>
-      <w:r>
-        <w:rPr>
-          <w:rFonts w:ascii="맑은 고딕" w:eastAsia="맑은 고딕" w:hAnsi="맑은 고딕" w:hint="eastAsia"/>
-          <w:color w:val="000000"/>
-          <w:sz w:val="21"/>
-          <w:szCs w:val="21"/>
-        </w:rPr>
-        <w:t>WITH  </w:t>
-      </w:r>
-      <w:proofErr w:type="spellStart"/>
-      <w:r>
-        <w:rPr>
-          <w:rFonts w:ascii="맑은 고딕" w:eastAsia="맑은 고딕" w:hAnsi="맑은 고딕" w:hint="eastAsia"/>
-          <w:color w:val="000000"/>
-          <w:sz w:val="21"/>
-          <w:szCs w:val="21"/>
-        </w:rPr>
-        <w:t>뒤의값을</w:t>
-      </w:r>
-      <w:proofErr w:type="spellEnd"/>
-      <w:proofErr w:type="gramEnd"/>
-      <w:r>
-        <w:rPr>
-          <w:rFonts w:ascii="맑은 고딕" w:eastAsia="맑은 고딕" w:hAnsi="맑은 고딕" w:hint="eastAsia"/>
-          <w:color w:val="000000"/>
-          <w:sz w:val="21"/>
-          <w:szCs w:val="21"/>
-        </w:rPr>
-        <w:t> 1로바꿔준다.</w:t>
-      </w:r>
-    </w:p>
-    <w:p>
-      <w:pPr>
-        <w:pStyle w:val="a3"/>
-        <w:spacing w:before="0" w:beforeAutospacing="0" w:after="0" w:afterAutospacing="0" w:line="300" w:lineRule="atLeast"/>
-        <w:rPr>
-          <w:rFonts w:ascii="맑은 고딕" w:eastAsia="맑은 고딕" w:hAnsi="맑은 고딕" w:hint="eastAsia"/>
-          <w:color w:val="000000"/>
-          <w:sz w:val="20"/>
-          <w:szCs w:val="20"/>
-        </w:rPr>
-      </w:pPr>
-    </w:p>
-    <w:p>
-      <w:pPr>
-        <w:pStyle w:val="a3"/>
-        <w:spacing w:before="0" w:beforeAutospacing="0" w:after="0" w:afterAutospacing="0" w:line="300" w:lineRule="atLeast"/>
-        <w:rPr>
-          <w:rFonts w:ascii="맑은 고딕" w:eastAsia="맑은 고딕" w:hAnsi="맑은 고딕" w:hint="eastAsia"/>
-          <w:color w:val="000000"/>
-          <w:sz w:val="20"/>
-          <w:szCs w:val="20"/>
-        </w:rPr>
-      </w:pPr>
-      <w:r>
-        <w:rPr>
-          <w:rFonts w:ascii="맑은 고딕" w:eastAsia="맑은 고딕" w:hAnsi="맑은 고딕" w:hint="eastAsia"/>
-          <w:color w:val="000000"/>
-          <w:sz w:val="21"/>
-          <w:szCs w:val="21"/>
-        </w:rPr>
-        <w:t xml:space="preserve">4. 이전에는 시퀀스 </w:t>
-      </w:r>
-      <w:proofErr w:type="spellStart"/>
-      <w:r>
-        <w:rPr>
-          <w:rFonts w:ascii="맑은 고딕" w:eastAsia="맑은 고딕" w:hAnsi="맑은 고딕" w:hint="eastAsia"/>
-          <w:color w:val="000000"/>
-          <w:sz w:val="21"/>
-          <w:szCs w:val="21"/>
-        </w:rPr>
-        <w:t>생성문을</w:t>
-      </w:r>
-      <w:proofErr w:type="spellEnd"/>
-      <w:r>
-        <w:rPr>
-          <w:rFonts w:ascii="맑은 고딕" w:eastAsia="맑은 고딕" w:hAnsi="맑은 고딕" w:hint="eastAsia"/>
-          <w:color w:val="000000"/>
-          <w:sz w:val="21"/>
-          <w:szCs w:val="21"/>
-        </w:rPr>
-        <w:t xml:space="preserve"> 보면 맨 끝에, NOCYCLE뒤에 NOKEEP NOSCALE GLOBAL 옵션이 붙었으나, 11g버전부터는 사용하지 않으므로 붙이지 않는다.</w:t>
-      </w:r>
-    </w:p>
-    <w:p>
-      <w:pPr>
-        <w:pStyle w:val="a3"/>
-        <w:spacing w:before="0" w:beforeAutospacing="0" w:after="0" w:afterAutospacing="0" w:line="300" w:lineRule="atLeast"/>
-        <w:rPr>
-          <w:rFonts w:ascii="맑은 고딕" w:eastAsia="맑은 고딕" w:hAnsi="맑은 고딕" w:hint="eastAsia"/>
-          <w:color w:val="000000"/>
-          <w:sz w:val="20"/>
-          <w:szCs w:val="20"/>
-        </w:rPr>
-      </w:pPr>
-      <w:r>
-        <w:rPr>
-          <w:rFonts w:ascii="맑은 고딕" w:eastAsia="맑은 고딕" w:hAnsi="맑은 고딕" w:hint="eastAsia"/>
-          <w:color w:val="000000"/>
-          <w:sz w:val="21"/>
-          <w:szCs w:val="21"/>
-        </w:rPr>
-        <w:t>   (</w:t>
-      </w:r>
-      <w:proofErr w:type="gramStart"/>
-      <w:r>
-        <w:rPr>
-          <w:rFonts w:ascii="맑은 고딕" w:eastAsia="맑은 고딕" w:hAnsi="맑은 고딕" w:hint="eastAsia"/>
-          <w:color w:val="000000"/>
-          <w:sz w:val="21"/>
-          <w:szCs w:val="21"/>
-        </w:rPr>
-        <w:t>참고 :</w:t>
-      </w:r>
-      <w:proofErr w:type="gramEnd"/>
-      <w:r>
-        <w:rPr>
-          <w:rFonts w:ascii="맑은 고딕" w:eastAsia="맑은 고딕" w:hAnsi="맑은 고딕" w:hint="eastAsia"/>
-          <w:color w:val="000000"/>
-          <w:sz w:val="21"/>
-          <w:szCs w:val="21"/>
-        </w:rPr>
-        <w:t xml:space="preserve"> NOKEEP옵션-</w:t>
-      </w:r>
-      <w:proofErr w:type="spellStart"/>
-      <w:r>
-        <w:rPr>
-          <w:rFonts w:ascii="맑은 고딕" w:eastAsia="맑은 고딕" w:hAnsi="맑은 고딕" w:hint="eastAsia"/>
-          <w:color w:val="000000"/>
-          <w:sz w:val="21"/>
-          <w:szCs w:val="21"/>
-        </w:rPr>
-        <w:t>프로그램테스트혹은성능시험을하는동안현재값보호하지</w:t>
-      </w:r>
-      <w:proofErr w:type="spellEnd"/>
-      <w:r>
-        <w:rPr>
-          <w:rFonts w:ascii="맑은 고딕" w:eastAsia="맑은 고딕" w:hAnsi="맑은 고딕" w:hint="eastAsia"/>
-          <w:color w:val="000000"/>
-          <w:sz w:val="21"/>
-          <w:szCs w:val="21"/>
-        </w:rPr>
-        <w:t xml:space="preserve"> 않음. NOSCALE-SCALE옵션을 사용하게 되면 시퀀스 값 앞에 3자리 세션오프셋과 3자리 </w:t>
-      </w:r>
-      <w:proofErr w:type="spellStart"/>
-      <w:r>
-        <w:rPr>
-          <w:rFonts w:ascii="맑은 고딕" w:eastAsia="맑은 고딕" w:hAnsi="맑은 고딕" w:hint="eastAsia"/>
-          <w:color w:val="000000"/>
-          <w:sz w:val="21"/>
-          <w:szCs w:val="21"/>
-        </w:rPr>
-        <w:t>인스턴스</w:t>
-      </w:r>
-      <w:proofErr w:type="spellEnd"/>
-      <w:r>
-        <w:rPr>
-          <w:rFonts w:ascii="맑은 고딕" w:eastAsia="맑은 고딕" w:hAnsi="맑은 고딕" w:hint="eastAsia"/>
-          <w:color w:val="000000"/>
-          <w:sz w:val="21"/>
-          <w:szCs w:val="21"/>
-        </w:rPr>
-        <w:t xml:space="preserve"> 오프셋</w:t>
-      </w:r>
-      <w:proofErr w:type="gramStart"/>
-      <w:r>
-        <w:rPr>
-          <w:rFonts w:ascii="맑은 고딕" w:eastAsia="맑은 고딕" w:hAnsi="맑은 고딕" w:hint="eastAsia"/>
-          <w:color w:val="000000"/>
-          <w:sz w:val="21"/>
-          <w:szCs w:val="21"/>
-        </w:rPr>
-        <w:t>,총</w:t>
-      </w:r>
-      <w:proofErr w:type="gramEnd"/>
-      <w:r>
-        <w:rPr>
-          <w:rFonts w:ascii="맑은 고딕" w:eastAsia="맑은 고딕" w:hAnsi="맑은 고딕" w:hint="eastAsia"/>
-          <w:color w:val="000000"/>
-          <w:sz w:val="21"/>
-          <w:szCs w:val="21"/>
-        </w:rPr>
-        <w:t xml:space="preserve"> 6자리의 접두사가 붙는데 이것을 사용하지 </w:t>
-      </w:r>
-      <w:proofErr w:type="spellStart"/>
-      <w:r>
-        <w:rPr>
-          <w:rFonts w:ascii="맑은 고딕" w:eastAsia="맑은 고딕" w:hAnsi="맑은 고딕" w:hint="eastAsia"/>
-          <w:color w:val="000000"/>
-          <w:sz w:val="21"/>
-          <w:szCs w:val="21"/>
-        </w:rPr>
-        <w:t>않는다는것</w:t>
-      </w:r>
-      <w:proofErr w:type="spellEnd"/>
-      <w:r>
-        <w:rPr>
-          <w:rFonts w:ascii="맑은 고딕" w:eastAsia="맑은 고딕" w:hAnsi="맑은 고딕" w:hint="eastAsia"/>
-          <w:color w:val="000000"/>
-          <w:sz w:val="21"/>
-          <w:szCs w:val="21"/>
-        </w:rPr>
-        <w:t>. GLOBAL-</w:t>
-      </w:r>
-      <w:proofErr w:type="spellStart"/>
-      <w:r>
-        <w:rPr>
-          <w:rFonts w:ascii="맑은 고딕" w:eastAsia="맑은 고딕" w:hAnsi="맑은 고딕" w:hint="eastAsia"/>
-          <w:color w:val="000000"/>
-          <w:sz w:val="21"/>
-          <w:szCs w:val="21"/>
-        </w:rPr>
-        <w:t>해당시퀀스를여러사용자가사용가능하다는</w:t>
-      </w:r>
-      <w:proofErr w:type="spellEnd"/>
-      <w:r>
-        <w:rPr>
-          <w:rFonts w:ascii="맑은 고딕" w:eastAsia="맑은 고딕" w:hAnsi="맑은 고딕" w:hint="eastAsia"/>
-          <w:color w:val="000000"/>
-          <w:sz w:val="21"/>
-          <w:szCs w:val="21"/>
-        </w:rPr>
-        <w:t xml:space="preserve"> 것.)</w:t>
-      </w:r>
-    </w:p>
-    <w:p>
-      <w:pPr>
-        <w:pStyle w:val="a3"/>
-        <w:spacing w:before="0" w:beforeAutospacing="0" w:after="0" w:afterAutospacing="0" w:line="300" w:lineRule="atLeast"/>
-        <w:rPr>
-          <w:rFonts w:ascii="맑은 고딕" w:eastAsia="맑은 고딕" w:hAnsi="맑은 고딕" w:hint="eastAsia"/>
-          <w:color w:val="000000"/>
-          <w:sz w:val="20"/>
-          <w:szCs w:val="20"/>
-        </w:rPr>
-      </w:pPr>
-    </w:p>
-    <w:p>
-      <w:pPr>
-        <w:pStyle w:val="a3"/>
-        <w:spacing w:before="0" w:beforeAutospacing="0" w:after="0" w:afterAutospacing="0" w:line="300" w:lineRule="atLeast"/>
-        <w:rPr>
-          <w:rFonts w:ascii="맑은 고딕" w:eastAsia="맑은 고딕" w:hAnsi="맑은 고딕" w:hint="eastAsia"/>
-          <w:color w:val="000000"/>
-          <w:sz w:val="20"/>
-          <w:szCs w:val="20"/>
-        </w:rPr>
-      </w:pPr>
-    </w:p>
-    <w:p>
-      <w:pPr>
-        <w:pStyle w:val="a3"/>
-        <w:spacing w:before="0" w:beforeAutospacing="0" w:after="0" w:afterAutospacing="0" w:line="300" w:lineRule="atLeast"/>
-        <w:rPr>
-          <w:rFonts w:ascii="맑은 고딕" w:eastAsia="맑은 고딕" w:hAnsi="맑은 고딕" w:hint="eastAsia"/>
-          <w:color w:val="000000"/>
-          <w:sz w:val="20"/>
-          <w:szCs w:val="20"/>
-        </w:rPr>
-      </w:pPr>
-    </w:p>
-    <w:p>
-      <w:pPr>
-        <w:pStyle w:val="a3"/>
-        <w:spacing w:before="0" w:beforeAutospacing="0" w:after="0" w:afterAutospacing="0" w:line="300" w:lineRule="atLeast"/>
-        <w:rPr>
-          <w:rFonts w:ascii="맑은 고딕" w:eastAsia="맑은 고딕" w:hAnsi="맑은 고딕" w:hint="eastAsia"/>
-          <w:color w:val="000000"/>
-          <w:sz w:val="20"/>
-          <w:szCs w:val="20"/>
-        </w:rPr>
-      </w:pPr>
-      <w:r>
-        <w:rPr>
-          <w:rFonts w:ascii="맑은 고딕" w:eastAsia="맑은 고딕" w:hAnsi="맑은 고딕" w:hint="eastAsia"/>
-          <w:color w:val="000000"/>
-          <w:sz w:val="20"/>
-          <w:szCs w:val="20"/>
-        </w:rPr>
-        <w:t>위의 4번의 </w:t>
-      </w:r>
       <w:r>
         <w:rPr>
           <w:rFonts w:ascii="맑은 고딕" w:eastAsia="맑은 고딕" w:hAnsi="맑은 고딕" w:hint="eastAsia"/>
@@ -2062,7 +2213,7 @@
           <w:bCs/>
           <w:color w:val="000000"/>
         </w:rPr>
-        <w:t xml:space="preserve">DDL </w:t>
+        <w:t xml:space="preserve"> </w:t>
       </w:r>
       <w:proofErr w:type="spellStart"/>
       <w:r>
@@ -2072,71 +2223,62 @@
           <w:bCs/>
           <w:color w:val="000000"/>
         </w:rPr>
-        <w:t>익스포트</w:t>
+        <w:t>옵션</w:t>
+      </w:r>
+      <w:r>
+        <w:rPr>
+          <w:rFonts w:ascii="맑은 고딕" w:eastAsia="맑은 고딕" w:hAnsi="맑은 고딕" w:hint="eastAsia"/>
+          <w:color w:val="000000"/>
+          <w:sz w:val="20"/>
+          <w:szCs w:val="20"/>
+        </w:rPr>
+        <w:t>설명</w:t>
       </w:r>
       <w:proofErr w:type="spellEnd"/>
-      <w:r>
-        <w:rPr>
-          <w:rFonts w:ascii="맑은 고딕" w:eastAsia="맑은 고딕" w:hAnsi="맑은 고딕" w:hint="eastAsia"/>
-          <w:b/>
-          <w:bCs/>
-          <w:color w:val="000000"/>
-        </w:rPr>
-        <w:t xml:space="preserve"> 옵션</w:t>
-      </w:r>
-      <w:r>
-        <w:rPr>
-          <w:rFonts w:ascii="맑은 고딕" w:eastAsia="맑은 고딕" w:hAnsi="맑은 고딕" w:hint="eastAsia"/>
-          <w:color w:val="000000"/>
-          <w:sz w:val="20"/>
-          <w:szCs w:val="20"/>
-        </w:rPr>
-        <w:t>설명</w:t>
-      </w:r>
-    </w:p>
-    <w:p>
-      <w:pPr>
-        <w:pStyle w:val="a3"/>
-        <w:spacing w:before="0" w:beforeAutospacing="0" w:after="0" w:afterAutospacing="0" w:line="300" w:lineRule="atLeast"/>
-        <w:rPr>
-          <w:rFonts w:ascii="맑은 고딕" w:eastAsia="맑은 고딕" w:hAnsi="맑은 고딕" w:hint="eastAsia"/>
-          <w:color w:val="000000"/>
-          <w:sz w:val="20"/>
-          <w:szCs w:val="20"/>
-        </w:rPr>
-      </w:pPr>
-    </w:p>
-    <w:p>
-      <w:pPr>
-        <w:pStyle w:val="a3"/>
-        <w:spacing w:before="0" w:beforeAutospacing="0" w:after="0" w:afterAutospacing="0" w:line="300" w:lineRule="atLeast"/>
-        <w:rPr>
-          <w:rFonts w:ascii="맑은 고딕" w:eastAsia="맑은 고딕" w:hAnsi="맑은 고딕" w:hint="eastAsia"/>
-          <w:color w:val="000000"/>
-          <w:sz w:val="20"/>
-          <w:szCs w:val="20"/>
-        </w:rPr>
-      </w:pPr>
-    </w:p>
-    <w:p>
-      <w:pPr>
-        <w:pStyle w:val="a3"/>
-        <w:spacing w:before="0" w:beforeAutospacing="0" w:after="0" w:afterAutospacing="0" w:line="300" w:lineRule="atLeast"/>
-        <w:rPr>
-          <w:rFonts w:ascii="맑은 고딕" w:eastAsia="맑은 고딕" w:hAnsi="맑은 고딕" w:hint="eastAsia"/>
-          <w:color w:val="000000"/>
-          <w:sz w:val="20"/>
-          <w:szCs w:val="20"/>
-        </w:rPr>
-      </w:pPr>
-      <w:r>
-        <w:rPr>
-          <w:rFonts w:ascii="맑은 고딕" w:eastAsia="맑은 고딕" w:hAnsi="맑은 고딕" w:hint="eastAsia"/>
-          <w:color w:val="000000"/>
-          <w:sz w:val="21"/>
-          <w:szCs w:val="21"/>
-        </w:rPr>
-        <w:t xml:space="preserve">옵션1. 보기 쉽게 인쇄 - </w:t>
+    </w:p>
+    <w:p>
+      <w:pPr>
+        <w:pStyle w:val="a3"/>
+        <w:spacing w:before="0" w:beforeAutospacing="0" w:after="0" w:afterAutospacing="0" w:line="300" w:lineRule="atLeast"/>
+        <w:rPr>
+          <w:rFonts w:ascii="맑은 고딕" w:eastAsia="맑은 고딕" w:hAnsi="맑은 고딕"/>
+          <w:color w:val="000000"/>
+          <w:sz w:val="20"/>
+          <w:szCs w:val="20"/>
+        </w:rPr>
+      </w:pPr>
+    </w:p>
+    <w:p>
+      <w:pPr>
+        <w:pStyle w:val="a3"/>
+        <w:spacing w:before="0" w:beforeAutospacing="0" w:after="0" w:afterAutospacing="0" w:line="300" w:lineRule="atLeast"/>
+        <w:rPr>
+          <w:rFonts w:ascii="맑은 고딕" w:eastAsia="맑은 고딕" w:hAnsi="맑은 고딕"/>
+          <w:color w:val="000000"/>
+          <w:sz w:val="20"/>
+          <w:szCs w:val="20"/>
+        </w:rPr>
+      </w:pPr>
+    </w:p>
+    <w:p>
+      <w:pPr>
+        <w:pStyle w:val="a3"/>
+        <w:spacing w:before="0" w:beforeAutospacing="0" w:after="0" w:afterAutospacing="0" w:line="300" w:lineRule="atLeast"/>
+        <w:rPr>
+          <w:rFonts w:ascii="맑은 고딕" w:eastAsia="맑은 고딕" w:hAnsi="맑은 고딕"/>
+          <w:color w:val="000000"/>
+          <w:sz w:val="20"/>
+          <w:szCs w:val="20"/>
+        </w:rPr>
+      </w:pPr>
+      <w:r>
+        <w:rPr>
+          <w:rFonts w:ascii="맑은 고딕" w:eastAsia="맑은 고딕" w:hAnsi="맑은 고딕" w:hint="eastAsia"/>
+          <w:color w:val="000000"/>
+          <w:sz w:val="21"/>
+          <w:szCs w:val="21"/>
+        </w:rPr>
+        <w:t xml:space="preserve">옵션1. 보기 쉽게 인쇄 - 말그대로 보기 쉽게, </w:t>
       </w:r>
       <w:proofErr w:type="spellStart"/>
       <w:r>
@@ -2146,7 +2288,7 @@
           <w:sz w:val="21"/>
           <w:szCs w:val="21"/>
         </w:rPr>
-        <w:t>말그대로</w:t>
+        <w:t>개행을</w:t>
       </w:r>
       <w:proofErr w:type="spellEnd"/>
       <w:r>
@@ -2156,26 +2298,6 @@
           <w:sz w:val="21"/>
           <w:szCs w:val="21"/>
         </w:rPr>
-        <w:t xml:space="preserve"> 보기 쉽게, </w:t>
-      </w:r>
-      <w:proofErr w:type="spellStart"/>
-      <w:r>
-        <w:rPr>
-          <w:rFonts w:ascii="맑은 고딕" w:eastAsia="맑은 고딕" w:hAnsi="맑은 고딕" w:hint="eastAsia"/>
-          <w:color w:val="000000"/>
-          <w:sz w:val="21"/>
-          <w:szCs w:val="21"/>
-        </w:rPr>
-        <w:t>개행을</w:t>
-      </w:r>
-      <w:proofErr w:type="spellEnd"/>
-      <w:r>
-        <w:rPr>
-          <w:rFonts w:ascii="맑은 고딕" w:eastAsia="맑은 고딕" w:hAnsi="맑은 고딕" w:hint="eastAsia"/>
-          <w:color w:val="000000"/>
-          <w:sz w:val="21"/>
-          <w:szCs w:val="21"/>
-        </w:rPr>
         <w:t xml:space="preserve"> 해서 보여준다.</w:t>
       </w:r>
     </w:p>
@@ -2184,7 +2306,7 @@
         <w:pStyle w:val="a3"/>
         <w:spacing w:before="0" w:beforeAutospacing="0" w:after="0" w:afterAutospacing="0" w:line="300" w:lineRule="atLeast"/>
         <w:rPr>
-          <w:rFonts w:ascii="맑은 고딕" w:eastAsia="맑은 고딕" w:hAnsi="맑은 고딕" w:hint="eastAsia"/>
+          <w:rFonts w:ascii="맑은 고딕" w:eastAsia="맑은 고딕" w:hAnsi="맑은 고딕"/>
           <w:color w:val="000000"/>
           <w:sz w:val="20"/>
           <w:szCs w:val="20"/>
@@ -2254,31 +2376,31 @@
         <w:pStyle w:val="a3"/>
         <w:spacing w:before="0" w:beforeAutospacing="0" w:after="0" w:afterAutospacing="0" w:line="300" w:lineRule="atLeast"/>
         <w:rPr>
-          <w:rFonts w:ascii="맑은 고딕" w:eastAsia="맑은 고딕" w:hAnsi="맑은 고딕" w:hint="eastAsia"/>
-          <w:color w:val="000000"/>
-          <w:sz w:val="20"/>
-          <w:szCs w:val="20"/>
-        </w:rPr>
-      </w:pPr>
-    </w:p>
-    <w:p>
-      <w:pPr>
-        <w:pStyle w:val="a3"/>
-        <w:spacing w:before="0" w:beforeAutospacing="0" w:after="0" w:afterAutospacing="0" w:line="300" w:lineRule="atLeast"/>
-        <w:rPr>
-          <w:rFonts w:ascii="맑은 고딕" w:eastAsia="맑은 고딕" w:hAnsi="맑은 고딕" w:hint="eastAsia"/>
-          <w:color w:val="000000"/>
-          <w:sz w:val="20"/>
-          <w:szCs w:val="20"/>
-        </w:rPr>
-      </w:pPr>
-    </w:p>
-    <w:p>
-      <w:pPr>
-        <w:pStyle w:val="a3"/>
-        <w:spacing w:before="0" w:beforeAutospacing="0" w:after="0" w:afterAutospacing="0" w:line="300" w:lineRule="atLeast"/>
-        <w:rPr>
-          <w:rFonts w:ascii="맑은 고딕" w:eastAsia="맑은 고딕" w:hAnsi="맑은 고딕" w:hint="eastAsia"/>
+          <w:rFonts w:ascii="맑은 고딕" w:eastAsia="맑은 고딕" w:hAnsi="맑은 고딕"/>
+          <w:color w:val="000000"/>
+          <w:sz w:val="20"/>
+          <w:szCs w:val="20"/>
+        </w:rPr>
+      </w:pPr>
+    </w:p>
+    <w:p>
+      <w:pPr>
+        <w:pStyle w:val="a3"/>
+        <w:spacing w:before="0" w:beforeAutospacing="0" w:after="0" w:afterAutospacing="0" w:line="300" w:lineRule="atLeast"/>
+        <w:rPr>
+          <w:rFonts w:ascii="맑은 고딕" w:eastAsia="맑은 고딕" w:hAnsi="맑은 고딕"/>
+          <w:color w:val="000000"/>
+          <w:sz w:val="20"/>
+          <w:szCs w:val="20"/>
+        </w:rPr>
+      </w:pPr>
+    </w:p>
+    <w:p>
+      <w:pPr>
+        <w:pStyle w:val="a3"/>
+        <w:spacing w:before="0" w:beforeAutospacing="0" w:after="0" w:afterAutospacing="0" w:line="300" w:lineRule="atLeast"/>
+        <w:rPr>
+          <w:rFonts w:ascii="맑은 고딕" w:eastAsia="맑은 고딕" w:hAnsi="맑은 고딕"/>
           <w:color w:val="000000"/>
           <w:sz w:val="20"/>
           <w:szCs w:val="20"/>
@@ -2348,43 +2470,43 @@
         <w:pStyle w:val="a3"/>
         <w:spacing w:before="0" w:beforeAutospacing="0" w:after="0" w:afterAutospacing="0" w:line="300" w:lineRule="atLeast"/>
         <w:rPr>
-          <w:rFonts w:ascii="맑은 고딕" w:eastAsia="맑은 고딕" w:hAnsi="맑은 고딕" w:hint="eastAsia"/>
-          <w:color w:val="000000"/>
-          <w:sz w:val="20"/>
-          <w:szCs w:val="20"/>
-        </w:rPr>
-      </w:pPr>
-    </w:p>
-    <w:p>
-      <w:pPr>
-        <w:pStyle w:val="a3"/>
-        <w:spacing w:before="0" w:beforeAutospacing="0" w:after="0" w:afterAutospacing="0" w:line="300" w:lineRule="atLeast"/>
-        <w:rPr>
-          <w:rFonts w:ascii="맑은 고딕" w:eastAsia="맑은 고딕" w:hAnsi="맑은 고딕" w:hint="eastAsia"/>
-          <w:color w:val="000000"/>
-          <w:sz w:val="20"/>
-          <w:szCs w:val="20"/>
-        </w:rPr>
-      </w:pPr>
-    </w:p>
-    <w:p>
-      <w:pPr>
-        <w:pStyle w:val="a3"/>
-        <w:spacing w:before="0" w:beforeAutospacing="0" w:after="0" w:afterAutospacing="0" w:line="300" w:lineRule="atLeast"/>
-        <w:rPr>
-          <w:rFonts w:ascii="맑은 고딕" w:eastAsia="맑은 고딕" w:hAnsi="맑은 고딕" w:hint="eastAsia"/>
-          <w:color w:val="000000"/>
-          <w:sz w:val="20"/>
-          <w:szCs w:val="20"/>
-        </w:rPr>
-      </w:pPr>
-    </w:p>
-    <w:p>
-      <w:pPr>
-        <w:pStyle w:val="a3"/>
-        <w:spacing w:before="0" w:beforeAutospacing="0" w:after="0" w:afterAutospacing="0" w:line="300" w:lineRule="atLeast"/>
-        <w:rPr>
-          <w:rFonts w:ascii="맑은 고딕" w:eastAsia="맑은 고딕" w:hAnsi="맑은 고딕" w:hint="eastAsia"/>
+          <w:rFonts w:ascii="맑은 고딕" w:eastAsia="맑은 고딕" w:hAnsi="맑은 고딕"/>
+          <w:color w:val="000000"/>
+          <w:sz w:val="20"/>
+          <w:szCs w:val="20"/>
+        </w:rPr>
+      </w:pPr>
+    </w:p>
+    <w:p>
+      <w:pPr>
+        <w:pStyle w:val="a3"/>
+        <w:spacing w:before="0" w:beforeAutospacing="0" w:after="0" w:afterAutospacing="0" w:line="300" w:lineRule="atLeast"/>
+        <w:rPr>
+          <w:rFonts w:ascii="맑은 고딕" w:eastAsia="맑은 고딕" w:hAnsi="맑은 고딕"/>
+          <w:color w:val="000000"/>
+          <w:sz w:val="20"/>
+          <w:szCs w:val="20"/>
+        </w:rPr>
+      </w:pPr>
+    </w:p>
+    <w:p>
+      <w:pPr>
+        <w:pStyle w:val="a3"/>
+        <w:spacing w:before="0" w:beforeAutospacing="0" w:after="0" w:afterAutospacing="0" w:line="300" w:lineRule="atLeast"/>
+        <w:rPr>
+          <w:rFonts w:ascii="맑은 고딕" w:eastAsia="맑은 고딕" w:hAnsi="맑은 고딕"/>
+          <w:color w:val="000000"/>
+          <w:sz w:val="20"/>
+          <w:szCs w:val="20"/>
+        </w:rPr>
+      </w:pPr>
+    </w:p>
+    <w:p>
+      <w:pPr>
+        <w:pStyle w:val="a3"/>
+        <w:spacing w:before="0" w:beforeAutospacing="0" w:after="0" w:afterAutospacing="0" w:line="300" w:lineRule="atLeast"/>
+        <w:rPr>
+          <w:rFonts w:ascii="맑은 고딕" w:eastAsia="맑은 고딕" w:hAnsi="맑은 고딕"/>
           <w:color w:val="000000"/>
           <w:sz w:val="20"/>
           <w:szCs w:val="20"/>
@@ -2425,7 +2547,7 @@
         <w:pStyle w:val="a3"/>
         <w:spacing w:before="0" w:beforeAutospacing="0" w:after="0" w:afterAutospacing="0" w:line="300" w:lineRule="atLeast"/>
         <w:rPr>
-          <w:rFonts w:ascii="맑은 고딕" w:eastAsia="맑은 고딕" w:hAnsi="맑은 고딕" w:hint="eastAsia"/>
+          <w:rFonts w:ascii="맑은 고딕" w:eastAsia="맑은 고딕" w:hAnsi="맑은 고딕"/>
           <w:color w:val="000000"/>
           <w:sz w:val="20"/>
           <w:szCs w:val="20"/>
@@ -2495,19 +2617,19 @@
         <w:pStyle w:val="a3"/>
         <w:spacing w:before="0" w:beforeAutospacing="0" w:after="0" w:afterAutospacing="0" w:line="300" w:lineRule="atLeast"/>
         <w:rPr>
-          <w:rFonts w:ascii="맑은 고딕" w:eastAsia="맑은 고딕" w:hAnsi="맑은 고딕" w:hint="eastAsia"/>
-          <w:color w:val="000000"/>
-          <w:sz w:val="20"/>
-          <w:szCs w:val="20"/>
-        </w:rPr>
-      </w:pPr>
-    </w:p>
-    <w:p>
-      <w:pPr>
-        <w:pStyle w:val="a3"/>
-        <w:spacing w:before="0" w:beforeAutospacing="0" w:after="0" w:afterAutospacing="0" w:line="300" w:lineRule="atLeast"/>
-        <w:rPr>
-          <w:rFonts w:ascii="맑은 고딕" w:eastAsia="맑은 고딕" w:hAnsi="맑은 고딕" w:hint="eastAsia"/>
+          <w:rFonts w:ascii="맑은 고딕" w:eastAsia="맑은 고딕" w:hAnsi="맑은 고딕"/>
+          <w:color w:val="000000"/>
+          <w:sz w:val="20"/>
+          <w:szCs w:val="20"/>
+        </w:rPr>
+      </w:pPr>
+    </w:p>
+    <w:p>
+      <w:pPr>
+        <w:pStyle w:val="a3"/>
+        <w:spacing w:before="0" w:beforeAutospacing="0" w:after="0" w:afterAutospacing="0" w:line="300" w:lineRule="atLeast"/>
+        <w:rPr>
+          <w:rFonts w:ascii="맑은 고딕" w:eastAsia="맑은 고딕" w:hAnsi="맑은 고딕"/>
           <w:color w:val="000000"/>
           <w:sz w:val="20"/>
           <w:szCs w:val="20"/>
@@ -2576,31 +2698,31 @@
         <w:pStyle w:val="a3"/>
         <w:spacing w:before="0" w:beforeAutospacing="0" w:after="0" w:afterAutospacing="0" w:line="300" w:lineRule="atLeast"/>
         <w:rPr>
-          <w:rFonts w:ascii="맑은 고딕" w:eastAsia="맑은 고딕" w:hAnsi="맑은 고딕" w:hint="eastAsia"/>
-          <w:color w:val="000000"/>
-          <w:sz w:val="20"/>
-          <w:szCs w:val="20"/>
-        </w:rPr>
-      </w:pPr>
-    </w:p>
-    <w:p>
-      <w:pPr>
-        <w:pStyle w:val="a3"/>
-        <w:spacing w:before="0" w:beforeAutospacing="0" w:after="0" w:afterAutospacing="0" w:line="300" w:lineRule="atLeast"/>
-        <w:rPr>
-          <w:rFonts w:ascii="맑은 고딕" w:eastAsia="맑은 고딕" w:hAnsi="맑은 고딕" w:hint="eastAsia"/>
-          <w:color w:val="000000"/>
-          <w:sz w:val="20"/>
-          <w:szCs w:val="20"/>
-        </w:rPr>
-      </w:pPr>
-    </w:p>
-    <w:p>
-      <w:pPr>
-        <w:pStyle w:val="a3"/>
-        <w:spacing w:before="0" w:beforeAutospacing="0" w:after="0" w:afterAutospacing="0" w:line="300" w:lineRule="atLeast"/>
-        <w:rPr>
-          <w:rFonts w:ascii="맑은 고딕" w:eastAsia="맑은 고딕" w:hAnsi="맑은 고딕" w:hint="eastAsia"/>
+          <w:rFonts w:ascii="맑은 고딕" w:eastAsia="맑은 고딕" w:hAnsi="맑은 고딕"/>
+          <w:color w:val="000000"/>
+          <w:sz w:val="20"/>
+          <w:szCs w:val="20"/>
+        </w:rPr>
+      </w:pPr>
+    </w:p>
+    <w:p>
+      <w:pPr>
+        <w:pStyle w:val="a3"/>
+        <w:spacing w:before="0" w:beforeAutospacing="0" w:after="0" w:afterAutospacing="0" w:line="300" w:lineRule="atLeast"/>
+        <w:rPr>
+          <w:rFonts w:ascii="맑은 고딕" w:eastAsia="맑은 고딕" w:hAnsi="맑은 고딕"/>
+          <w:color w:val="000000"/>
+          <w:sz w:val="20"/>
+          <w:szCs w:val="20"/>
+        </w:rPr>
+      </w:pPr>
+    </w:p>
+    <w:p>
+      <w:pPr>
+        <w:pStyle w:val="a3"/>
+        <w:spacing w:before="0" w:beforeAutospacing="0" w:after="0" w:afterAutospacing="0" w:line="300" w:lineRule="atLeast"/>
+        <w:rPr>
+          <w:rFonts w:ascii="맑은 고딕" w:eastAsia="맑은 고딕" w:hAnsi="맑은 고딕"/>
           <w:color w:val="000000"/>
           <w:sz w:val="20"/>
           <w:szCs w:val="20"/>
@@ -2691,7 +2813,7 @@
         <w:pStyle w:val="a3"/>
         <w:spacing w:before="0" w:beforeAutospacing="0" w:after="0" w:afterAutospacing="0" w:line="300" w:lineRule="atLeast"/>
         <w:rPr>
-          <w:rFonts w:ascii="맑은 고딕" w:eastAsia="맑은 고딕" w:hAnsi="맑은 고딕" w:hint="eastAsia"/>
+          <w:rFonts w:ascii="맑은 고딕" w:eastAsia="맑은 고딕" w:hAnsi="맑은 고딕"/>
           <w:color w:val="000000"/>
           <w:sz w:val="20"/>
           <w:szCs w:val="20"/>
@@ -2760,7 +2882,7 @@
         <w:pStyle w:val="a3"/>
         <w:spacing w:before="0" w:beforeAutospacing="0" w:after="0" w:afterAutospacing="0" w:line="300" w:lineRule="atLeast"/>
         <w:rPr>
-          <w:rFonts w:ascii="맑은 고딕" w:eastAsia="맑은 고딕" w:hAnsi="맑은 고딕" w:hint="eastAsia"/>
+          <w:rFonts w:ascii="맑은 고딕" w:eastAsia="맑은 고딕" w:hAnsi="맑은 고딕"/>
           <w:color w:val="000000"/>
           <w:sz w:val="20"/>
           <w:szCs w:val="20"/>
@@ -2829,31 +2951,31 @@
         <w:pStyle w:val="a3"/>
         <w:spacing w:before="0" w:beforeAutospacing="0" w:after="0" w:afterAutospacing="0" w:line="300" w:lineRule="atLeast"/>
         <w:rPr>
-          <w:rFonts w:ascii="맑은 고딕" w:eastAsia="맑은 고딕" w:hAnsi="맑은 고딕" w:hint="eastAsia"/>
-          <w:color w:val="000000"/>
-          <w:sz w:val="20"/>
-          <w:szCs w:val="20"/>
-        </w:rPr>
-      </w:pPr>
-    </w:p>
-    <w:p>
-      <w:pPr>
-        <w:pStyle w:val="a3"/>
-        <w:spacing w:before="0" w:beforeAutospacing="0" w:after="0" w:afterAutospacing="0" w:line="300" w:lineRule="atLeast"/>
-        <w:rPr>
-          <w:rFonts w:ascii="맑은 고딕" w:eastAsia="맑은 고딕" w:hAnsi="맑은 고딕" w:hint="eastAsia"/>
-          <w:color w:val="000000"/>
-          <w:sz w:val="20"/>
-          <w:szCs w:val="20"/>
-        </w:rPr>
-      </w:pPr>
-    </w:p>
-    <w:p>
-      <w:pPr>
-        <w:pStyle w:val="a3"/>
-        <w:spacing w:before="0" w:beforeAutospacing="0" w:after="0" w:afterAutospacing="0" w:line="300" w:lineRule="atLeast"/>
-        <w:rPr>
-          <w:rFonts w:ascii="맑은 고딕" w:eastAsia="맑은 고딕" w:hAnsi="맑은 고딕" w:hint="eastAsia"/>
+          <w:rFonts w:ascii="맑은 고딕" w:eastAsia="맑은 고딕" w:hAnsi="맑은 고딕"/>
+          <w:color w:val="000000"/>
+          <w:sz w:val="20"/>
+          <w:szCs w:val="20"/>
+        </w:rPr>
+      </w:pPr>
+    </w:p>
+    <w:p>
+      <w:pPr>
+        <w:pStyle w:val="a3"/>
+        <w:spacing w:before="0" w:beforeAutospacing="0" w:after="0" w:afterAutospacing="0" w:line="300" w:lineRule="atLeast"/>
+        <w:rPr>
+          <w:rFonts w:ascii="맑은 고딕" w:eastAsia="맑은 고딕" w:hAnsi="맑은 고딕"/>
+          <w:color w:val="000000"/>
+          <w:sz w:val="20"/>
+          <w:szCs w:val="20"/>
+        </w:rPr>
+      </w:pPr>
+    </w:p>
+    <w:p>
+      <w:pPr>
+        <w:pStyle w:val="a3"/>
+        <w:spacing w:before="0" w:beforeAutospacing="0" w:after="0" w:afterAutospacing="0" w:line="300" w:lineRule="atLeast"/>
+        <w:rPr>
+          <w:rFonts w:ascii="맑은 고딕" w:eastAsia="맑은 고딕" w:hAnsi="맑은 고딕"/>
           <w:color w:val="000000"/>
           <w:sz w:val="20"/>
           <w:szCs w:val="20"/>
@@ -2867,7 +2989,7 @@
           <w:szCs w:val="21"/>
         </w:rPr>
         <w:lastRenderedPageBreak/>
-        <w:t xml:space="preserve">옵션4. </w:t>
+        <w:t>옵션4. 터미네이터 - </w:t>
       </w:r>
       <w:proofErr w:type="spellStart"/>
       <w:r>
@@ -2877,7 +2999,7 @@
           <w:sz w:val="21"/>
           <w:szCs w:val="21"/>
         </w:rPr>
-        <w:t>터미네이터</w:t>
+        <w:t>맨끝에세미클론이붙는다</w:t>
       </w:r>
       <w:proofErr w:type="spellEnd"/>
       <w:r>
@@ -2887,26 +3009,6 @@
           <w:sz w:val="21"/>
           <w:szCs w:val="21"/>
         </w:rPr>
-        <w:t xml:space="preserve"> - </w:t>
-      </w:r>
-      <w:proofErr w:type="spellStart"/>
-      <w:r>
-        <w:rPr>
-          <w:rFonts w:ascii="맑은 고딕" w:eastAsia="맑은 고딕" w:hAnsi="맑은 고딕" w:hint="eastAsia"/>
-          <w:color w:val="000000"/>
-          <w:sz w:val="21"/>
-          <w:szCs w:val="21"/>
-        </w:rPr>
-        <w:t>맨끝에세미클론이붙는다</w:t>
-      </w:r>
-      <w:proofErr w:type="spellEnd"/>
-      <w:r>
-        <w:rPr>
-          <w:rFonts w:ascii="맑은 고딕" w:eastAsia="맑은 고딕" w:hAnsi="맑은 고딕" w:hint="eastAsia"/>
-          <w:color w:val="000000"/>
-          <w:sz w:val="21"/>
-          <w:szCs w:val="21"/>
-        </w:rPr>
         <w:t>.</w:t>
       </w:r>
     </w:p>
@@ -2915,7 +3017,7 @@
         <w:pStyle w:val="a3"/>
         <w:spacing w:before="0" w:beforeAutospacing="0" w:after="0" w:afterAutospacing="0" w:line="300" w:lineRule="atLeast"/>
         <w:rPr>
-          <w:rFonts w:ascii="맑은 고딕" w:eastAsia="맑은 고딕" w:hAnsi="맑은 고딕" w:hint="eastAsia"/>
+          <w:rFonts w:ascii="맑은 고딕" w:eastAsia="맑은 고딕" w:hAnsi="맑은 고딕"/>
           <w:color w:val="000000"/>
           <w:sz w:val="20"/>
           <w:szCs w:val="20"/>
@@ -2984,7 +3086,7 @@
         <w:pStyle w:val="a3"/>
         <w:spacing w:before="0" w:beforeAutospacing="0" w:after="0" w:afterAutospacing="0" w:line="300" w:lineRule="atLeast"/>
         <w:rPr>
-          <w:rFonts w:ascii="맑은 고딕" w:eastAsia="맑은 고딕" w:hAnsi="맑은 고딕" w:hint="eastAsia"/>
+          <w:rFonts w:ascii="맑은 고딕" w:eastAsia="맑은 고딕" w:hAnsi="맑은 고딕"/>
           <w:color w:val="000000"/>
           <w:sz w:val="20"/>
           <w:szCs w:val="20"/>
@@ -3053,31 +3155,31 @@
         <w:pStyle w:val="a3"/>
         <w:spacing w:before="0" w:beforeAutospacing="0" w:after="0" w:afterAutospacing="0" w:line="300" w:lineRule="atLeast"/>
         <w:rPr>
-          <w:rFonts w:ascii="맑은 고딕" w:eastAsia="맑은 고딕" w:hAnsi="맑은 고딕" w:hint="eastAsia"/>
-          <w:color w:val="000000"/>
-          <w:sz w:val="20"/>
-          <w:szCs w:val="20"/>
-        </w:rPr>
-      </w:pPr>
-    </w:p>
-    <w:p>
-      <w:pPr>
-        <w:pStyle w:val="a3"/>
-        <w:spacing w:before="0" w:beforeAutospacing="0" w:after="0" w:afterAutospacing="0" w:line="300" w:lineRule="atLeast"/>
-        <w:rPr>
-          <w:rFonts w:ascii="맑은 고딕" w:eastAsia="맑은 고딕" w:hAnsi="맑은 고딕" w:hint="eastAsia"/>
-          <w:color w:val="000000"/>
-          <w:sz w:val="20"/>
-          <w:szCs w:val="20"/>
-        </w:rPr>
-      </w:pPr>
-    </w:p>
-    <w:p>
-      <w:pPr>
-        <w:pStyle w:val="a3"/>
-        <w:spacing w:before="0" w:beforeAutospacing="0" w:after="0" w:afterAutospacing="0" w:line="300" w:lineRule="atLeast"/>
-        <w:rPr>
-          <w:rFonts w:ascii="맑은 고딕" w:eastAsia="맑은 고딕" w:hAnsi="맑은 고딕" w:hint="eastAsia"/>
+          <w:rFonts w:ascii="맑은 고딕" w:eastAsia="맑은 고딕" w:hAnsi="맑은 고딕"/>
+          <w:color w:val="000000"/>
+          <w:sz w:val="20"/>
+          <w:szCs w:val="20"/>
+        </w:rPr>
+      </w:pPr>
+    </w:p>
+    <w:p>
+      <w:pPr>
+        <w:pStyle w:val="a3"/>
+        <w:spacing w:before="0" w:beforeAutospacing="0" w:after="0" w:afterAutospacing="0" w:line="300" w:lineRule="atLeast"/>
+        <w:rPr>
+          <w:rFonts w:ascii="맑은 고딕" w:eastAsia="맑은 고딕" w:hAnsi="맑은 고딕"/>
+          <w:color w:val="000000"/>
+          <w:sz w:val="20"/>
+          <w:szCs w:val="20"/>
+        </w:rPr>
+      </w:pPr>
+    </w:p>
+    <w:p>
+      <w:pPr>
+        <w:pStyle w:val="a3"/>
+        <w:spacing w:before="0" w:beforeAutospacing="0" w:after="0" w:afterAutospacing="0" w:line="300" w:lineRule="atLeast"/>
+        <w:rPr>
+          <w:rFonts w:ascii="맑은 고딕" w:eastAsia="맑은 고딕" w:hAnsi="맑은 고딕"/>
           <w:color w:val="000000"/>
           <w:sz w:val="20"/>
           <w:szCs w:val="20"/>
@@ -3121,7 +3223,7 @@
           <w:sz w:val="21"/>
           <w:szCs w:val="21"/>
         </w:rPr>
-        <w:t xml:space="preserve"> - </w:t>
+        <w:t xml:space="preserve"> - 뷰생성쿼리에</w:t>
       </w:r>
       <w:proofErr w:type="spellStart"/>
       <w:r>
@@ -3130,15 +3232,6 @@
           <w:color w:val="000000"/>
           <w:sz w:val="21"/>
           <w:szCs w:val="21"/>
-        </w:rPr>
-        <w:t>뷰생성쿼리에</w:t>
-      </w:r>
-      <w:r>
-        <w:rPr>
-          <w:rFonts w:ascii="맑은 고딕" w:eastAsia="맑은 고딕" w:hAnsi="맑은 고딕" w:hint="eastAsia"/>
-          <w:color w:val="000000"/>
-          <w:sz w:val="21"/>
-          <w:szCs w:val="21"/>
           <w:lang w:val="x-none"/>
         </w:rPr>
         <w:t>FORCE</w:t>
@@ -3168,19 +3261,19 @@
         <w:pStyle w:val="a3"/>
         <w:spacing w:before="0" w:beforeAutospacing="0" w:after="0" w:afterAutospacing="0" w:line="300" w:lineRule="atLeast"/>
         <w:rPr>
-          <w:rFonts w:ascii="맑은 고딕" w:eastAsia="맑은 고딕" w:hAnsi="맑은 고딕" w:hint="eastAsia"/>
-          <w:color w:val="000000"/>
-          <w:sz w:val="20"/>
-          <w:szCs w:val="20"/>
-        </w:rPr>
-      </w:pPr>
-    </w:p>
-    <w:p>
-      <w:pPr>
-        <w:pStyle w:val="a3"/>
-        <w:spacing w:before="0" w:beforeAutospacing="0" w:after="0" w:afterAutospacing="0" w:line="300" w:lineRule="atLeast"/>
-        <w:rPr>
-          <w:rFonts w:ascii="맑은 고딕" w:eastAsia="맑은 고딕" w:hAnsi="맑은 고딕" w:hint="eastAsia"/>
+          <w:rFonts w:ascii="맑은 고딕" w:eastAsia="맑은 고딕" w:hAnsi="맑은 고딕"/>
+          <w:color w:val="000000"/>
+          <w:sz w:val="20"/>
+          <w:szCs w:val="20"/>
+        </w:rPr>
+      </w:pPr>
+    </w:p>
+    <w:p>
+      <w:pPr>
+        <w:pStyle w:val="a3"/>
+        <w:spacing w:before="0" w:beforeAutospacing="0" w:after="0" w:afterAutospacing="0" w:line="300" w:lineRule="atLeast"/>
+        <w:rPr>
+          <w:rFonts w:ascii="맑은 고딕" w:eastAsia="맑은 고딕" w:hAnsi="맑은 고딕"/>
           <w:color w:val="000000"/>
           <w:sz w:val="20"/>
           <w:szCs w:val="20"/>
@@ -3234,7 +3327,7 @@
           <w:sz w:val="21"/>
           <w:szCs w:val="21"/>
         </w:rPr>
-        <w:t xml:space="preserve"> (Table) 가 없어도 </w:t>
+        <w:t xml:space="preserve"> (Table) 가 없어도 뷰 (View) 를 </w:t>
       </w:r>
       <w:proofErr w:type="spellStart"/>
       <w:r>
@@ -3244,7 +3337,7 @@
           <w:sz w:val="21"/>
           <w:szCs w:val="21"/>
         </w:rPr>
-        <w:t>뷰</w:t>
+        <w:t>만든다는것</w:t>
       </w:r>
       <w:proofErr w:type="spellEnd"/>
       <w:r>
@@ -3254,26 +3347,6 @@
           <w:sz w:val="21"/>
           <w:szCs w:val="21"/>
         </w:rPr>
-        <w:t xml:space="preserve"> (View) 를 </w:t>
-      </w:r>
-      <w:proofErr w:type="spellStart"/>
-      <w:r>
-        <w:rPr>
-          <w:rFonts w:ascii="맑은 고딕" w:eastAsia="맑은 고딕" w:hAnsi="맑은 고딕" w:hint="eastAsia"/>
-          <w:color w:val="000000"/>
-          <w:sz w:val="21"/>
-          <w:szCs w:val="21"/>
-        </w:rPr>
-        <w:t>만든다는것</w:t>
-      </w:r>
-      <w:proofErr w:type="spellEnd"/>
-      <w:r>
-        <w:rPr>
-          <w:rFonts w:ascii="맑은 고딕" w:eastAsia="맑은 고딕" w:hAnsi="맑은 고딕" w:hint="eastAsia"/>
-          <w:color w:val="000000"/>
-          <w:sz w:val="21"/>
-          <w:szCs w:val="21"/>
-        </w:rPr>
         <w:t>.</w:t>
       </w:r>
     </w:p>
@@ -3282,7 +3355,7 @@
         <w:pStyle w:val="a3"/>
         <w:spacing w:before="0" w:beforeAutospacing="0" w:after="0" w:afterAutospacing="0" w:line="300" w:lineRule="atLeast"/>
         <w:rPr>
-          <w:rFonts w:ascii="맑은 고딕" w:eastAsia="맑은 고딕" w:hAnsi="맑은 고딕" w:hint="eastAsia"/>
+          <w:rFonts w:ascii="맑은 고딕" w:eastAsia="맑은 고딕" w:hAnsi="맑은 고딕"/>
           <w:color w:val="000000"/>
           <w:sz w:val="22"/>
           <w:szCs w:val="22"/>
@@ -3351,19 +3424,19 @@
         <w:pStyle w:val="a3"/>
         <w:spacing w:before="0" w:beforeAutospacing="0" w:after="0" w:afterAutospacing="0" w:line="300" w:lineRule="atLeast"/>
         <w:rPr>
-          <w:rFonts w:ascii="맑은 고딕" w:eastAsia="맑은 고딕" w:hAnsi="맑은 고딕" w:hint="eastAsia"/>
-          <w:color w:val="000000"/>
-          <w:sz w:val="20"/>
-          <w:szCs w:val="20"/>
-        </w:rPr>
-      </w:pPr>
-    </w:p>
-    <w:p>
-      <w:pPr>
-        <w:pStyle w:val="a3"/>
-        <w:spacing w:before="0" w:beforeAutospacing="0" w:after="0" w:afterAutospacing="0" w:line="300" w:lineRule="atLeast"/>
-        <w:rPr>
-          <w:rFonts w:ascii="맑은 고딕" w:eastAsia="맑은 고딕" w:hAnsi="맑은 고딕" w:hint="eastAsia"/>
+          <w:rFonts w:ascii="맑은 고딕" w:eastAsia="맑은 고딕" w:hAnsi="맑은 고딕"/>
+          <w:color w:val="000000"/>
+          <w:sz w:val="20"/>
+          <w:szCs w:val="20"/>
+        </w:rPr>
+      </w:pPr>
+    </w:p>
+    <w:p>
+      <w:pPr>
+        <w:pStyle w:val="a3"/>
+        <w:spacing w:before="0" w:beforeAutospacing="0" w:after="0" w:afterAutospacing="0" w:line="300" w:lineRule="atLeast"/>
+        <w:rPr>
+          <w:rFonts w:ascii="맑은 고딕" w:eastAsia="맑은 고딕" w:hAnsi="맑은 고딕"/>
           <w:color w:val="000000"/>
           <w:sz w:val="20"/>
           <w:szCs w:val="20"/>
@@ -3433,19 +3506,19 @@
         <w:pStyle w:val="a3"/>
         <w:spacing w:before="0" w:beforeAutospacing="0" w:after="0" w:afterAutospacing="0" w:line="300" w:lineRule="atLeast"/>
         <w:rPr>
-          <w:rFonts w:ascii="맑은 고딕" w:eastAsia="맑은 고딕" w:hAnsi="맑은 고딕" w:hint="eastAsia"/>
-          <w:color w:val="000000"/>
-          <w:sz w:val="20"/>
-          <w:szCs w:val="20"/>
-        </w:rPr>
-      </w:pPr>
-    </w:p>
-    <w:p>
-      <w:pPr>
-        <w:pStyle w:val="a3"/>
-        <w:spacing w:before="0" w:beforeAutospacing="0" w:after="0" w:afterAutospacing="0" w:line="300" w:lineRule="atLeast"/>
-        <w:rPr>
-          <w:rFonts w:ascii="맑은 고딕" w:eastAsia="맑은 고딕" w:hAnsi="맑은 고딕" w:hint="eastAsia"/>
+          <w:rFonts w:ascii="맑은 고딕" w:eastAsia="맑은 고딕" w:hAnsi="맑은 고딕"/>
+          <w:color w:val="000000"/>
+          <w:sz w:val="20"/>
+          <w:szCs w:val="20"/>
+        </w:rPr>
+      </w:pPr>
+    </w:p>
+    <w:p>
+      <w:pPr>
+        <w:pStyle w:val="a3"/>
+        <w:spacing w:before="0" w:beforeAutospacing="0" w:after="0" w:afterAutospacing="0" w:line="300" w:lineRule="atLeast"/>
+        <w:rPr>
+          <w:rFonts w:ascii="맑은 고딕" w:eastAsia="맑은 고딕" w:hAnsi="맑은 고딕"/>
           <w:color w:val="000000"/>
           <w:sz w:val="22"/>
           <w:szCs w:val="22"/>
@@ -3457,20 +3530,20 @@
         <w:pStyle w:val="a3"/>
         <w:spacing w:before="0" w:beforeAutospacing="0" w:after="0" w:afterAutospacing="0" w:line="300" w:lineRule="atLeast"/>
         <w:rPr>
-          <w:rFonts w:ascii="맑은 고딕" w:eastAsia="맑은 고딕" w:hAnsi="맑은 고딕" w:hint="eastAsia"/>
-          <w:color w:val="000000"/>
-          <w:sz w:val="20"/>
-          <w:szCs w:val="20"/>
-        </w:rPr>
-      </w:pPr>
-      <w:r>
-        <w:rPr>
-          <w:rFonts w:ascii="맑은 고딕" w:eastAsia="맑은 고딕" w:hAnsi="맑은 고딕" w:hint="eastAsia"/>
-          <w:color w:val="000000"/>
-          <w:sz w:val="21"/>
-          <w:szCs w:val="21"/>
-        </w:rPr>
-        <w:t>옵션6. 저장영역 - </w:t>
+          <w:rFonts w:ascii="맑은 고딕" w:eastAsia="맑은 고딕" w:hAnsi="맑은 고딕"/>
+          <w:color w:val="000000"/>
+          <w:sz w:val="20"/>
+          <w:szCs w:val="20"/>
+        </w:rPr>
+      </w:pPr>
+      <w:r>
+        <w:rPr>
+          <w:rFonts w:ascii="맑은 고딕" w:eastAsia="맑은 고딕" w:hAnsi="맑은 고딕" w:hint="eastAsia"/>
+          <w:color w:val="000000"/>
+          <w:sz w:val="21"/>
+          <w:szCs w:val="21"/>
+        </w:rPr>
+        <w:t>옵션6. </w:t>
       </w:r>
       <w:proofErr w:type="spellStart"/>
       <w:r>
@@ -3480,6 +3553,26 @@
           <w:sz w:val="21"/>
           <w:szCs w:val="21"/>
         </w:rPr>
+        <w:t>저장영역</w:t>
+      </w:r>
+      <w:proofErr w:type="spellEnd"/>
+      <w:r>
+        <w:rPr>
+          <w:rFonts w:ascii="맑은 고딕" w:eastAsia="맑은 고딕" w:hAnsi="맑은 고딕" w:hint="eastAsia"/>
+          <w:color w:val="000000"/>
+          <w:sz w:val="21"/>
+          <w:szCs w:val="21"/>
+        </w:rPr>
+        <w:t xml:space="preserve"> - </w:t>
+      </w:r>
+      <w:proofErr w:type="spellStart"/>
+      <w:r>
+        <w:rPr>
+          <w:rFonts w:ascii="맑은 고딕" w:eastAsia="맑은 고딕" w:hAnsi="맑은 고딕" w:hint="eastAsia"/>
+          <w:color w:val="000000"/>
+          <w:sz w:val="21"/>
+          <w:szCs w:val="21"/>
+        </w:rPr>
         <w:t>저장영역이표시된다</w:t>
       </w:r>
       <w:proofErr w:type="spellEnd"/>
@@ -3498,7 +3591,7 @@
         <w:pStyle w:val="a3"/>
         <w:spacing w:before="0" w:beforeAutospacing="0" w:after="0" w:afterAutospacing="0" w:line="300" w:lineRule="atLeast"/>
         <w:rPr>
-          <w:rFonts w:ascii="맑은 고딕" w:eastAsia="맑은 고딕" w:hAnsi="맑은 고딕" w:hint="eastAsia"/>
+          <w:rFonts w:ascii="맑은 고딕" w:eastAsia="맑은 고딕" w:hAnsi="맑은 고딕"/>
           <w:color w:val="000000"/>
           <w:sz w:val="22"/>
           <w:szCs w:val="22"/>
@@ -3568,7 +3661,7 @@
         <w:pStyle w:val="a3"/>
         <w:spacing w:before="0" w:beforeAutospacing="0" w:after="0" w:afterAutospacing="0" w:line="300" w:lineRule="atLeast"/>
         <w:rPr>
-          <w:rFonts w:ascii="맑은 고딕" w:eastAsia="맑은 고딕" w:hAnsi="맑은 고딕" w:hint="eastAsia"/>
+          <w:rFonts w:ascii="맑은 고딕" w:eastAsia="맑은 고딕" w:hAnsi="맑은 고딕"/>
           <w:color w:val="000000"/>
           <w:sz w:val="20"/>
           <w:szCs w:val="20"/>
@@ -3633,10 +3726,7 @@
         </w:drawing>
       </w:r>
     </w:p>
-    <w:p>
-      <w:bookmarkStart w:id="0" w:name="_GoBack"/>
-      <w:bookmarkEnd w:id="0"/>
-    </w:p>
+    <w:p/>
     <w:sectPr>
       <w:pgSz w:w="12240" w:h="15840"/>
       <w:pgMar w:top="1701" w:right="1440" w:bottom="1440" w:left="1440" w:header="708" w:footer="708" w:gutter="0"/>
@@ -3648,7 +3738,7 @@
 </file>
 
 <file path=word/styles.xml><?xml version="1.0" encoding="utf-8"?>
-<w:styles xmlns:mc="http://schemas.openxmlformats.org/markup-compatibility/2006" xmlns:r="http://schemas.openxmlformats.org/officeDocument/2006/relationships" xmlns:w="http://schemas.openxmlformats.org/wordprocessingml/2006/main" xmlns:w14="http://schemas.microsoft.com/office/word/2010/wordml" xmlns:w15="http://schemas.microsoft.com/office/word/2012/wordml" mc:Ignorable="w14 w15">
+<w:styles xmlns:mc="http://schemas.openxmlformats.org/markup-compatibility/2006" xmlns:r="http://schemas.openxmlformats.org/officeDocument/2006/relationships" xmlns:w="http://schemas.openxmlformats.org/wordprocessingml/2006/main" xmlns:w14="http://schemas.microsoft.com/office/word/2010/wordml" xmlns:w15="http://schemas.microsoft.com/office/word/2012/wordml" xmlns:w16se="http://schemas.microsoft.com/office/word/2015/wordml/symex" mc:Ignorable="w14 w15 w16se">
   <w:docDefaults>
     <w:rPrDefault>
       <w:rPr>

</xml_diff>